<commit_message>
refactor: introduce text cleaning utility to remove em-dashes and specific author references while simplifying document layout separators.
</commit_message>
<xml_diff>
--- a/result/Ketika_Jiwa_Pulang_ke_Sunyi.docx
+++ b/result/Ketika_Jiwa_Pulang_ke_Sunyi.docx
@@ -20,7 +20,7 @@
           <w:color w:val="1B5E20"/>
           <w:sz w:val="28"/>
         </w:rPr>
-        <w:t>❖   ❖   ❖</w:t>
+        <w:t>❖ ❖ ❖</w:t>
       </w:r>
     </w:p>
     <w:p>
@@ -41,7 +41,7 @@
     </w:p>
     <w:p>
       <w:pPr>
-        <w:spacing w:before="0" w:after="480" w:line="300" w:lineRule="auto"/>
+        <w:spacing w:before="0" w:after="560" w:line="300" w:lineRule="auto"/>
         <w:jc w:val="center"/>
       </w:pPr>
       <w:r>
@@ -57,22 +57,6 @@
     </w:p>
     <w:p>
       <w:pPr>
-        <w:spacing w:before="0" w:after="720" w:line="300" w:lineRule="auto"/>
-        <w:jc w:val="center"/>
-      </w:pPr>
-      <w:r>
-        <w:rPr>
-          <w:rFonts w:ascii="Garamond" w:hAnsi="Garamond"/>
-          <w:b w:val="0"/>
-          <w:i w:val="0"/>
-          <w:color w:val="787878"/>
-          <w:sz w:val="20"/>
-        </w:rPr>
-        <w:t>— — — — — — — — — —</w:t>
-      </w:r>
-    </w:p>
-    <w:p>
-      <w:pPr>
         <w:spacing w:before="0" w:after="120" w:line="300" w:lineRule="auto"/>
         <w:jc w:val="center"/>
       </w:pPr>
@@ -100,7 +84,7 @@
           <w:color w:val="505050"/>
           <w:sz w:val="18"/>
         </w:rPr>
-        <w:t>1. When the Heart is Lonely — Habib Isa Alkaff, Habib Ja'far Al Jufri, &amp; Bang Fathur</w:t>
+        <w:t>1. When the Heart is Lonely, Habib Isa Alkaff, Habib Ja'far Al Jufri, &amp; Bang Fathur</w:t>
       </w:r>
     </w:p>
     <w:p>
@@ -116,7 +100,7 @@
           <w:color w:val="505050"/>
           <w:sz w:val="18"/>
         </w:rPr>
-        <w:t>2. Kabur Aja Dulu — Habib Ja'far Al Jufri &amp; Ustadz Fikri Nadjib</w:t>
+        <w:t>2. Kabur Aja Dulu, Habib Ja'far Al Jufri &amp; Ustadz Fikri Nadjib</w:t>
       </w:r>
     </w:p>
     <w:p>
@@ -132,12 +116,12 @@
           <w:color w:val="505050"/>
           <w:sz w:val="18"/>
         </w:rPr>
-        <w:t>3. Luka Akan Sembuh — Ustadz Salim A. Fillah, Hyung Hammad Rosyadi, &amp; Ustadz Amri Fatmi</w:t>
+        <w:t>3. Luka Akan Sembuh, Ustadz Salim A. Fillah, Hyung Hammad Rosyadi, &amp; Ustadz Amri Fatmi</w:t>
       </w:r>
     </w:p>
     <w:p>
       <w:pPr>
-        <w:spacing w:before="960"/>
+        <w:spacing w:before="1120"/>
       </w:pPr>
     </w:p>
     <w:p>
@@ -169,7 +153,7 @@
           <w:color w:val="787878"/>
           <w:sz w:val="19"/>
         </w:rPr>
-        <w:t>Yogyakarta — 2026</w:t>
+        <w:t>Yogyakarta, 2026</w:t>
       </w:r>
     </w:p>
     <w:p>
@@ -369,7 +353,7 @@
                 <w:i/>
                 <w:sz w:val="21"/>
               </w:rPr>
-              <w:t>— Tere Liye, Catatan Perjalanan Batin</w:t>
+              <w:t>(Catatan Perjalanan Batin)</w:t>
             </w:r>
           </w:p>
         </w:tc>
@@ -430,7 +414,7 @@
           <w:color w:val="787878"/>
           <w:sz w:val="20"/>
         </w:rPr>
-        <w:t>— ❖ —</w:t>
+        <w:t>❖</w:t>
       </w:r>
     </w:p>
     <w:p>
@@ -498,7 +482,7 @@
           <w:color w:val="000000"/>
           <w:sz w:val="23"/>
         </w:rPr>
-        <w:t>Namun di dalam dada pemuda itu—dan barangkali juga di dalam dadamu yang sedang membaca lembar demi lembar buku ini—ada ruang hampa yang teramat sunyi. Ruang hampa yang tidak bisa diisi oleh seribu ucapan selamat, tidak bisa dihangatkan oleh secangkir kopi panas di kafe megah, dan tidak bisa disembuhkan oleh tidur berjam-jam di kasur yang empuk.</w:t>
+        <w:t>Namun di dalam dada pemuda itu, dan barangkali juga di dalam dadamu yang sedang membaca lembar demi lembar buku ini, ada ruang hampa yang teramat sunyi. Ruang hampa yang tidak bisa diisi oleh seribu ucapan selamat, tidak bisa dihangatkan oleh secangkir kopi panas di kafe megah, dan tidak bisa disembuhkan oleh tidur berjam-jam di kasur yang empuk.</w:t>
       </w:r>
     </w:p>
     <w:p>
@@ -617,7 +601,7 @@
           <w:color w:val="000000"/>
           <w:sz w:val="23"/>
         </w:rPr>
-        <w:t>Buku ini lahir dari saripati tiga perbincangan mendalam di ruang kajian 'On The Way Talk'—tentang bagaimana menatap rasa sepi bersama Habib Isa Alkaff, Habib Ja'far Al Jufri, dan Bang Fathur; tentang keberanian mengambil jeda dan menjaga jarak dari racun dunia bersama Ustadz Fikri Nadjib; serta tentang seni memeluk luka dan menatap takdir bersama Ustadz Salim A. Fillah, Hyung Hammad Rosyadi, dan Ustadz Dr. Amri Fatmi.</w:t>
+        <w:t>Buku ini lahir dari saripati tiga perbincangan mendalam di ruang kajian 'On The Way Talk', tentang bagaimana menatap rasa sepi bersama Habib Isa Alkaff, Habib Ja'far Al Jufri, dan Bang Fathur; tentang keberanian mengambil jeda dan menjaga jarak dari racun dunia bersama Ustadz Fikri Nadjib; serta tentang seni memeluk luka dan menatap takdir bersama Ustadz Salim A. Fillah, Hyung Hammad Rosyadi, dan Ustadz Dr. Amri Fatmi.</w:t>
       </w:r>
     </w:p>
     <w:p>
@@ -1029,7 +1013,7 @@
           <w:color w:val="787878"/>
           <w:sz w:val="19"/>
         </w:rPr>
-        <w:t>Inspirasi Kajian: When the Heart is Lonely — Habib Isa Alkaff, Habib Ja'far Al Jufri, &amp; Bang Fathur</w:t>
+        <w:t>Inspirasi Kajian: When the Heart is Lonely, Habib Isa Alkaff, Habib Ja'far Al Jufri, &amp; Bang Fathur</w:t>
       </w:r>
     </w:p>
     <w:p>
@@ -1098,7 +1082,7 @@
           <w:color w:val="787878"/>
           <w:sz w:val="20"/>
         </w:rPr>
-        <w:t>— ❖ —</w:t>
+        <w:t>❖</w:t>
       </w:r>
     </w:p>
     <w:tbl>
@@ -1181,7 +1165,7 @@
                 <w:color w:val="1B5E20"/>
                 <w:sz w:val="18"/>
               </w:rPr>
-              <w:t>— QS. Al-Baqarah: 186</w:t>
+              <w:t>(QS. Al-Baqarah: 186)</w:t>
             </w:r>
           </w:p>
           <w:p>
@@ -1222,7 +1206,7 @@
                 <w:color w:val="1B5E20"/>
                 <w:sz w:val="18"/>
               </w:rPr>
-              <w:t>— HR. Bukhari no. 2893</w:t>
+              <w:t>(HR. Bukhari no. 2893)</w:t>
             </w:r>
           </w:p>
         </w:tc>
@@ -1348,7 +1332,7 @@
           <w:color w:val="000000"/>
           <w:sz w:val="23"/>
         </w:rPr>
-        <w:t>Kau tidak sendirian dalam perasaan ini, kawan. Kesepian bukanlah tanda bahwa kau cacat atau tidak laku. Kesepian adalah alarm alami dari jiwamu—sinyal bahwa ada kebutuhan batin yang selama ini kau abaikan dengan sengaja.</w:t>
+        <w:t>Kau tidak sendirian dalam perasaan ini, kawan. Kesepian bukanlah tanda bahwa kau cacat atau tidak laku. Kesepian adalah alarm alami dari jiwamu, sinyal bahwa ada kebutuhan batin yang selama ini kau abaikan dengan sengaja.</w:t>
       </w:r>
     </w:p>
     <w:p>
@@ -1432,7 +1416,7 @@
           <w:color w:val="000000"/>
           <w:sz w:val="22"/>
         </w:rPr>
-        <w:t>Namun, sains modern juga menemukan bahwa otak manusia memiliki kapasitas neuroplastisitas yang luar biasa. Sirkuit kecemasan di Amigdala dapat diredam secara signifikan melalui apa yang disebut para psikolog sebagai 'Spiritual Attachment Security'—rasa aman dan terikat secara batin dengan Dzat Yang Maha Melindungi.</w:t>
+        <w:t>Namun, sains modern juga menemukan bahwa otak manusia memiliki kapasitas neuroplastisitas yang luar biasa. Sirkuit kecemasan di Amigdala dapat diredam secara signifikan melalui apa yang disebut para psikolog sebagai 'Spiritual Attachment Security', rasa aman dan terikat secara batin dengan Dzat Yang Maha Melindungi.</w:t>
       </w:r>
     </w:p>
     <w:p>
@@ -1491,7 +1475,7 @@
                 <w:color w:val="1B5E20"/>
                 <w:sz w:val="21"/>
               </w:rPr>
-              <w:t>🌿  Dialog Mindful: Menyapa Sunyi Tanpa Rasa Takut</w:t>
+              <w:t>🌿 Dialog Mindful: Menyapa Sunyi Tanpa Rasa Takut</w:t>
             </w:r>
           </w:p>
           <w:p>
@@ -1709,7 +1693,7 @@
           <w:color w:val="787878"/>
           <w:sz w:val="20"/>
         </w:rPr>
-        <w:t>— ❖ —</w:t>
+        <w:t>❖</w:t>
       </w:r>
     </w:p>
     <w:tbl>
@@ -1792,7 +1776,7 @@
                 <w:color w:val="1B5E20"/>
                 <w:sz w:val="18"/>
               </w:rPr>
-              <w:t>— QS. Ar-Ra'd: 28</w:t>
+              <w:t>(QS. Ar-Ra'd: 28)</w:t>
             </w:r>
           </w:p>
           <w:p>
@@ -1833,7 +1817,7 @@
                 <w:color w:val="1B5E20"/>
                 <w:sz w:val="18"/>
               </w:rPr>
-              <w:t>— HR. Thabrani dalam Al-Mu'jam Al-Kabir</w:t>
+              <w:t>(HR. Thabrani dalam Al-Mu'jam Al-Kabir)</w:t>
             </w:r>
           </w:p>
         </w:tc>
@@ -1942,7 +1926,7 @@
           <w:color w:val="000000"/>
           <w:sz w:val="23"/>
         </w:rPr>
-        <w:t>Mengapa bisa demikian? Karena hati manusia diciptakan oleh Allah dengan kapasitas tak terhingga (*infinite capacity*). Hati adalah tempat di mana rasa cinta, kerinduan, dan keagungan bersemayam. Jika kau mencoba memasukkan hal-hal yang fana, sempit, dan terbatas—seperti pujian manusia, jabatan sementara, atau gemerlap harta—ke dalam wadah yang berukuran tak terbatas, tentu saja wadah itu tidak akan pernah penuh.</w:t>
+        <w:t>Mengapa bisa demikian? Karena hati manusia diciptakan oleh Allah dengan kapasitas tak terhingga (*infinite capacity*). Hati adalah tempat di mana rasa cinta, kerinduan, dan keagungan bersemayam. Jika kau mencoba memasukkan hal-hal yang fana, sempit, dan terbatas, seperti pujian manusia, jabatan sementara, atau gemerlap harta, ke dalam wadah yang berukuran tak terbatas, tentu saja wadah itu tidak akan pernah penuh.</w:t>
       </w:r>
     </w:p>
     <w:p>
@@ -2009,7 +1993,7 @@
           <w:color w:val="000000"/>
           <w:sz w:val="22"/>
         </w:rPr>
-        <w:t>Secara neurokimia, media sosial dirancang dengan mekanisme 'Variable Reward Schedule'—prinsip yang sama dengan mesin judi kasino. Setiap kali ponselmu bergetar atau ada notifikasi baru masuk, otak melepaskan percikan hormon Dopamin di area Ventral Striatum.</w:t>
+        <w:t>Secara neurokimia, media sosial dirancang dengan mekanisme 'Variable Reward Schedule', prinsip yang sama dengan mesin judi kasino. Setiap kali ponselmu bergetar atau ada notifikasi baru masuk, otak melepaskan percikan hormon Dopamin di area Ventral Striatum.</w:t>
       </w:r>
     </w:p>
     <w:p>
@@ -2077,7 +2061,7 @@
           <w:color w:val="000000"/>
           <w:sz w:val="22"/>
         </w:rPr>
-        <w:t>Kajian psikologi kognitif modern menganjurkan praktik 'Digital Fasting' dan 'Mindful Presence'—yang dalam tradisi Islam telah diajarkan berabad-abad silam melalui konsep Dzikir dan Tafakkur. Melalui dzikir yang teratur, otak distabilkan kembali, melepaskan ketergantungan semu pada validasi eksternal.</w:t>
+        <w:t>Kajian psikologi kognitif modern menganjurkan praktik 'Digital Fasting' dan 'Mindful Presence', yang dalam tradisi Islam telah diajarkan berabad-abad silam melalui konsep Dzikir dan Tafakkur. Melalui dzikir yang teratur, otak distabilkan kembali, melepaskan ketergantungan semu pada validasi eksternal.</w:t>
       </w:r>
     </w:p>
     <w:tbl>
@@ -2119,7 +2103,7 @@
                 <w:color w:val="1B5E20"/>
                 <w:sz w:val="21"/>
               </w:rPr>
-              <w:t>🌿  Dialog Mindful: Melepaskan Tuntutan Menjadi Sempurna</w:t>
+              <w:t>🌿 Dialog Mindful: Melepaskan Tuntutan Menjadi Sempurna</w:t>
             </w:r>
           </w:p>
           <w:p>
@@ -2350,7 +2334,7 @@
           <w:color w:val="787878"/>
           <w:sz w:val="20"/>
         </w:rPr>
-        <w:t>— ❖ —</w:t>
+        <w:t>❖</w:t>
       </w:r>
     </w:p>
     <w:tbl>
@@ -2433,7 +2417,7 @@
                 <w:color w:val="1B5E20"/>
                 <w:sz w:val="18"/>
               </w:rPr>
-              <w:t>— QS. Al-Anbiya: 87</w:t>
+              <w:t>(QS. Al-Anbiya: 87)</w:t>
             </w:r>
           </w:p>
           <w:p>
@@ -2474,7 +2458,7 @@
                 <w:color w:val="1B5E20"/>
                 <w:sz w:val="18"/>
               </w:rPr>
-              <w:t>— HR. Tirmidzi no. 3505 (Doa Penawar Kesulitan)</w:t>
+              <w:t>(HR. Tirmidzi no. 3505 (Doa Penawar Kesulitan))</w:t>
             </w:r>
           </w:p>
         </w:tc>
@@ -2532,7 +2516,7 @@
           <w:color w:val="000000"/>
           <w:sz w:val="23"/>
         </w:rPr>
-        <w:t>Kesepian adalah keterasingan yang menyiksa—ketika kau merasa terbuang, tidak diinginkan, dan kosong melompong. Sedangkan menyepi adalah pilihan sadar untuk melangkah mundur dari kebisingan dunia, demi memberi ruang bagi jiwamu untuk kembali bercakap-cakap dengan Tuhannya.</w:t>
+        <w:t>Kesepian adalah keterasingan yang menyiksa, ketika kau merasa terbuang, tidak diinginkan, dan kosong melompong. Sedangkan menyepi adalah pilihan sadar untuk melangkah mundur dari kebisingan dunia, demi memberi ruang bagi jiwamu untuk kembali bercakap-cakap dengan Tuhannya.</w:t>
       </w:r>
     </w:p>
     <w:p>
@@ -2684,7 +2668,7 @@
           <w:color w:val="000000"/>
           <w:sz w:val="22"/>
         </w:rPr>
-        <w:t>Jika tidak diarahkan dengan baik, DMN yang hiperaktif di bawah pengaruh stres akan memicu siklus 'Ruminasi Depresif'—memutar ulang kesalahan masa lalu dan mengantisipasi skenario terburuk secara berulang-ulang.</w:t>
+        <w:t>Jika tidak diarahkan dengan baik, DMN yang hiperaktif di bawah pengaruh stres akan memicu siklus 'Ruminasi Depresif', memutar ulang kesalahan masa lalu dan mengantisipasi skenario terburuk secara berulang-ulang.</w:t>
       </w:r>
     </w:p>
     <w:p>
@@ -2718,7 +2702,7 @@
           <w:color w:val="000000"/>
           <w:sz w:val="22"/>
         </w:rPr>
-        <w:t>Psikologi positif menyebut fenomena ini sebagai 'Constructive Solitude'—kesendirian yang menumbuhkan. Orang yang menguasai seni menyepi memiliki resiliensi emosional 60% lebih tinggi dalam menghadapi krisis kehidupan dibandingkan mereka yang selalu bergantung pada kerumunan untuk merasa aman.</w:t>
+        <w:t>Psikologi positif menyebut fenomena ini sebagai 'Constructive Solitude', kesendirian yang menumbuhkan. Orang yang menguasai seni menyepi memiliki resiliensi emosional 60% lebih tinggi dalam menghadapi krisis kehidupan dibandingkan mereka yang selalu bergantung pada kerumunan untuk merasa aman.</w:t>
       </w:r>
     </w:p>
     <w:p>
@@ -2777,7 +2761,7 @@
                 <w:color w:val="1B5E20"/>
                 <w:sz w:val="21"/>
               </w:rPr>
-              <w:t>🌿  Dialog Mindful: Menikmati Keheningan Sujud</w:t>
+              <w:t>🌿 Dialog Mindful: Menikmati Keheningan Sujud</w:t>
             </w:r>
           </w:p>
           <w:p>
@@ -2995,7 +2979,7 @@
           <w:color w:val="787878"/>
           <w:sz w:val="20"/>
         </w:rPr>
-        <w:t>— ❖ —</w:t>
+        <w:t>❖</w:t>
       </w:r>
     </w:p>
     <w:tbl>
@@ -3078,7 +3062,7 @@
                 <w:color w:val="1B5E20"/>
                 <w:sz w:val="18"/>
               </w:rPr>
-              <w:t>— QS. Al-Qashash: 24</w:t>
+              <w:t>(QS. Al-Qashash: 24)</w:t>
             </w:r>
           </w:p>
           <w:p>
@@ -3119,7 +3103,7 @@
                 <w:color w:val="1B5E20"/>
                 <w:sz w:val="18"/>
               </w:rPr>
-              <w:t>— Doa Nabi Musa AS di Bawah Pohon Madyan</w:t>
+              <w:t>(Doa Nabi Musa AS di Bawah Pohon Madyan)</w:t>
             </w:r>
           </w:p>
         </w:tc>
@@ -3160,7 +3144,7 @@
           <w:color w:val="000000"/>
           <w:sz w:val="23"/>
         </w:rPr>
-        <w:t>Pernahkah kau berdiri lama di depan cermin kamar mandimu setelah membasuh muka? Kau menatap sepasang mata di dalam cermin itu—sepasang mata yang tampak begitu lelah, dengan lingkaran hitam di bawahnya dan tatapan yang kehilangan binar keceriaan masa kecil.</w:t>
+        <w:t>Pernahkah kau berdiri lama di depan cermin kamar mandimu setelah membasuh muka? Kau menatap sepasang mata di dalam cermin itu, sepasang mata yang tampak begitu lelah, dengan lingkaran hitam di bawahnya dan tatapan yang kehilangan binar keceriaan masa kecil.</w:t>
       </w:r>
     </w:p>
     <w:p>
@@ -3422,7 +3406,7 @@
                 <w:color w:val="1B5E20"/>
                 <w:sz w:val="21"/>
               </w:rPr>
-              <w:t>🌿  Dialog Mindful: Memeluk Diri Sendiri di Hadapan Allah</w:t>
+              <w:t>🌿 Dialog Mindful: Memeluk Diri Sendiri di Hadapan Allah</w:t>
             </w:r>
           </w:p>
           <w:p>
@@ -3645,7 +3629,7 @@
           <w:color w:val="787878"/>
           <w:sz w:val="19"/>
         </w:rPr>
-        <w:t>Inspirasi Kajian: Kabur Aja Dulu — Habib Ja'far Al Jufri &amp; Ustadz Fikri Nadjib</w:t>
+        <w:t>Inspirasi Kajian: Kabur Aja Dulu, Habib Ja'far Al Jufri &amp; Ustadz Fikri Nadjib</w:t>
       </w:r>
     </w:p>
     <w:p>
@@ -3714,7 +3698,7 @@
           <w:color w:val="787878"/>
           <w:sz w:val="20"/>
         </w:rPr>
-        <w:t>— ❖ —</w:t>
+        <w:t>❖</w:t>
       </w:r>
     </w:p>
     <w:tbl>
@@ -3797,7 +3781,7 @@
                 <w:color w:val="1B5E20"/>
                 <w:sz w:val="18"/>
               </w:rPr>
-              <w:t>— QS. Al-Baqarah: 286</w:t>
+              <w:t>(QS. Al-Baqarah: 286)</w:t>
             </w:r>
           </w:p>
           <w:p>
@@ -3838,7 +3822,7 @@
                 <w:color w:val="1B5E20"/>
                 <w:sz w:val="18"/>
               </w:rPr>
-              <w:t>— HR. Abu Dawud no. 5090</w:t>
+              <w:t>(HR. Abu Dawud no. 5090)</w:t>
             </w:r>
           </w:p>
         </w:tc>
@@ -3913,7 +3897,7 @@
           <w:color w:val="000000"/>
           <w:sz w:val="23"/>
         </w:rPr>
-        <w:t>Kau tahu jawabannya, kawan. Lelah yang sedang kau rasakan hari ini bukan lagi sekadar lelah otot yang bisa hilang dengan segelas minuman berenergi atau pijatan di punggung. Lelahmu adalah lelah eksistensial—kelelahan spiritual seorang hamba yang sudah terlalu lama berlari kencang tanpa tahu lagi ke mana arah garis akhir.</w:t>
+        <w:t>Kau tahu jawabannya, kawan. Lelah yang sedang kau rasakan hari ini bukan lagi sekadar lelah otot yang bisa hilang dengan segelas minuman berenergi atau pijatan di punggung. Lelahmu adalah lelah eksistensial, kelelahan spiritual seorang hamba yang sudah terlalu lama berlari kencang tanpa tahu lagi ke mana arah garis akhir.</w:t>
       </w:r>
     </w:p>
     <w:p>
@@ -4048,7 +4032,7 @@
           <w:color w:val="000000"/>
           <w:sz w:val="22"/>
         </w:rPr>
-        <w:t>Pada fase awal, kadar kortisol melonjak tinggi, menimbulkan insomnia, palpitasi jantung, dan hiper-kewaspadaan. Namun jika stresor berlanjut berbulan-bulan, aksis HPA mengalami 'Burnout Exhaustion'—kadar kortisol justru anjlok ke titik terendah (*hypocortisolemia*). Penderitanya mengalami kelelahan ekstrem di pagi hari, disfungsi kognitif (Brain Fog), dan kerentanan terhadap penyakit autoimun.</w:t>
+        <w:t>Pada fase awal, kadar kortisol melonjak tinggi, menimbulkan insomnia, palpitasi jantung, dan hiper-kewaspadaan. Namun jika stresor berlanjut berbulan-bulan, aksis HPA mengalami 'Burnout Exhaustion', kadar kortisol justru anjlok ke titik terendah (*hypocortisolemia*). Penderitanya mengalami kelelahan ekstrem di pagi hari, disfungsi kognitif (Brain Fog), dan kerentanan terhadap penyakit autoimun.</w:t>
       </w:r>
     </w:p>
     <w:p>
@@ -4065,7 +4049,7 @@
           <w:color w:val="000000"/>
           <w:sz w:val="22"/>
         </w:rPr>
-        <w:t>Penelitian neuro-imaging menunjukkan bahwa stres kronis yang tidak tertangani mengakibatkan atrofi (penyusutan volume) dendrit di area Hipokampus dan Prefrontal Cortex—area yang bertanggung jawab untuk memori kerja, konsentrasi, dan pengambilan keputusan rasional.</w:t>
+        <w:t>Penelitian neuro-imaging menunjukkan bahwa stres kronis yang tidak tertangani mengakibatkan atrofi (penyusutan volume) dendrit di area Hipokampus dan Prefrontal Cortex, area yang bertanggung jawab untuk memori kerja, konsentrasi, dan pengambilan keputusan rasional.</w:t>
       </w:r>
     </w:p>
     <w:p>
@@ -4082,7 +4066,7 @@
           <w:color w:val="000000"/>
           <w:sz w:val="22"/>
         </w:rPr>
-        <w:t>Sains membuktikan bahwa satu-satunya cara biologis untuk memutus rantai allostatic overload ini adalah dengan 'Strategic De-escalation'—menghentikan paparan terhadap pemicu stres, mengistirahatkan sistem saraf simpatik, dan membiarkan ritme sirkadian tubuh pulih secara alami.</w:t>
+        <w:t>Sains membuktikan bahwa satu-satunya cara biologis untuk memutus rantai allostatic overload ini adalah dengan 'Strategic De-escalation', menghentikan paparan terhadap pemicu stres, mengistirahatkan sistem saraf simpatik, dan membiarkan ritme sirkadian tubuh pulih secara alami.</w:t>
       </w:r>
     </w:p>
     <w:tbl>
@@ -4124,7 +4108,7 @@
                 <w:color w:val="1B5E20"/>
                 <w:sz w:val="21"/>
               </w:rPr>
-              <w:t>🌿  Dialog Mindful: Mengakui Keterbatasan Sebagai Manusia</w:t>
+              <w:t>🌿 Dialog Mindful: Mengakui Keterbatasan Sebagai Manusia</w:t>
             </w:r>
           </w:p>
           <w:p>
@@ -4355,7 +4339,7 @@
           <w:color w:val="787878"/>
           <w:sz w:val="20"/>
         </w:rPr>
-        <w:t>— ❖ —</w:t>
+        <w:t>❖</w:t>
       </w:r>
     </w:p>
     <w:tbl>
@@ -4438,7 +4422,7 @@
                 <w:color w:val="1B5E20"/>
                 <w:sz w:val="18"/>
               </w:rPr>
-              <w:t>— QS. Al-Kahf: 16</w:t>
+              <w:t>(QS. Al-Kahf: 16)</w:t>
             </w:r>
           </w:p>
           <w:p>
@@ -4479,7 +4463,7 @@
                 <w:color w:val="1B5E20"/>
                 <w:sz w:val="18"/>
               </w:rPr>
-              <w:t>— QS. Al-Kahf: 10</w:t>
+              <w:t>(QS. Al-Kahf: 10)</w:t>
             </w:r>
           </w:p>
         </w:tc>
@@ -4588,7 +4572,7 @@
           <w:color w:val="000000"/>
           <w:sz w:val="23"/>
         </w:rPr>
-        <w:t>Al-Qur'an mengabadikan keputusan mereka dengan kalimat yang sangat indah: *Fa'wu ilal kahfi*—'Maka carilah tempat berlindung ke dalam gua!' Mereka memilih 'kabur' dari sistem yang beracun, melangkah masuk ke dalam gua batu yang dingin dan gelap di lereng gunung demi menyelamatkan aset paling berharga di dalam dada mereka: iman, akal budi, dan ketentraman jiwa.</w:t>
+        <w:t>Al-Qur'an mengabadikan keputusan mereka dengan kalimat yang sangat indah: *Fa'wu ilal kahfi*, 'Maka carilah tempat berlindung ke dalam gua!' Mereka memilih 'kabur' dari sistem yang beracun, melangkah masuk ke dalam gua batu yang dingin dan gelap di lereng gunung demi menyelamatkan aset paling berharga di dalam dada mereka: iman, akal budi, dan ketentraman jiwa.</w:t>
       </w:r>
     </w:p>
     <w:p>
@@ -4672,7 +4656,7 @@
           <w:color w:val="000000"/>
           <w:sz w:val="22"/>
         </w:rPr>
-        <w:t>Psikologi lingkungan modern mengenal istilah 'Toxic Environmental Overload'—kondisi di mana rangsangan negatif eksternal yang terus-menerus (konflik interpersonal, intimidasi verbal, tuntutan kerja irasional) melumpuhkan daya lentur psikologis (psychological elasticity).</w:t>
+        <w:t>Psikologi lingkungan modern mengenal istilah 'Toxic Environmental Overload', kondisi di mana rangsangan negatif eksternal yang terus-menerus (konflik interpersonal, intimidasi verbal, tuntutan kerja irasional) melumpuhkan daya lentur psikologis (psychological elasticity).</w:t>
       </w:r>
     </w:p>
     <w:p>
@@ -4706,7 +4690,7 @@
           <w:color w:val="000000"/>
           <w:sz w:val="22"/>
         </w:rPr>
-        <w:t>Mengambil 'Strategic Withdrawal' atau 'Uzlah Terukur'—seperti mengambil cuti tanpa gawai, mengundurkan diri dari lingkungan pergaulan beracun, atau menyepi ke tempat baru yang tenang—secara biologis memicu proses pemulihan saraf (*Neural Regeneration*).</w:t>
+        <w:t>Mengambil 'Strategic Withdrawal' atau 'Uzlah Terukur', seperti mengambil cuti tanpa gawai, mengundurkan diri dari lingkungan pergaulan beracun, atau menyepi ke tempat baru yang tenang, secara biologis memicu proses pemulihan saraf (*Neural Regeneration*).</w:t>
       </w:r>
     </w:p>
     <w:p>
@@ -4782,7 +4766,7 @@
                 <w:color w:val="1B5E20"/>
                 <w:sz w:val="21"/>
               </w:rPr>
-              <w:t>🌿  Dialog Mindful: Menemukan Gua Hening di Dalam Dada</w:t>
+              <w:t>🌿 Dialog Mindful: Menemukan Gua Hening di Dalam Dada</w:t>
             </w:r>
           </w:p>
           <w:p>
@@ -5013,7 +4997,7 @@
           <w:color w:val="787878"/>
           <w:sz w:val="20"/>
         </w:rPr>
-        <w:t>— ❖ —</w:t>
+        <w:t>❖</w:t>
       </w:r>
     </w:p>
     <w:tbl>
@@ -5096,7 +5080,7 @@
                 <w:color w:val="1B5E20"/>
                 <w:sz w:val="18"/>
               </w:rPr>
-              <w:t>— QS. Al-Furqan: 63</w:t>
+              <w:t>(QS. Al-Furqan: 63)</w:t>
             </w:r>
           </w:p>
           <w:p>
@@ -5137,7 +5121,7 @@
                 <w:color w:val="1B5E20"/>
                 <w:sz w:val="18"/>
               </w:rPr>
-              <w:t>— HR. Thabrani dalam Ad-Du'a</w:t>
+              <w:t>(HR. Thabrani dalam Ad-Du'a)</w:t>
             </w:r>
           </w:p>
         </w:tc>
@@ -5263,7 +5247,7 @@
           <w:color w:val="000000"/>
           <w:sz w:val="23"/>
         </w:rPr>
-        <w:t>Lihatlah akhlak hamba-hamba Allah Yang Maha Penyayang (*'Ibadur Rahman*) yang dipuji dalam Surah Al-Furqan: ketika mereka disapa oleh orang-orang jahil yang memprovokasi, mencela, atau menguras energi mereka, mereka tidak terpancing untuk berdebat kusir. Mereka tidak membuang waktu membalas dendam. Mereka hanya tersenyum seraya mengucapkan: *Salaama*—'Semoga keselamatan menyertaimu, mari kita berpisah jalan dengan damai.'</w:t>
+        <w:t>Lihatlah akhlak hamba-hamba Allah Yang Maha Penyayang (*'Ibadur Rahman*) yang dipuji dalam Surah Al-Furqan: ketika mereka disapa oleh orang-orang jahil yang memprovokasi, mencela, atau menguras energi mereka, mereka tidak terpancing untuk berdebat kusir. Mereka tidak membuang waktu membalas dendam. Mereka hanya tersenyum seraya mengucapkan: *Salaama*, 'Semoga keselamatan menyertaimu, mari kita berpisah jalan dengan damai.'</w:t>
       </w:r>
     </w:p>
     <w:p>
@@ -5347,7 +5331,7 @@
           <w:color w:val="000000"/>
           <w:sz w:val="22"/>
         </w:rPr>
-        <w:t>Paparan berulang terhadap relasi yang manipulatif memicu respon 'Fawn Response'—salah satu bentuk respon trauma di mana korban secara otomatis berusaha menyenangkan dan menuruti kemauan pelaku agresi demi menghindari konflik atau penolakan.</w:t>
+        <w:t>Paparan berulang terhadap relasi yang manipulatif memicu respon 'Fawn Response', salah satu bentuk respon trauma di mana korban secara otomatis berusaha menyenangkan dan menuruti kemauan pelaku agresi demi menghindari konflik atau penolakan.</w:t>
       </w:r>
     </w:p>
     <w:p>
@@ -5381,7 +5365,7 @@
           <w:color w:val="000000"/>
           <w:sz w:val="22"/>
         </w:rPr>
-        <w:t>Islam memandang silaturahmi bukan sebagai pemaksaan untuk bertahan dalam kezaliman. Jika sebuah hubungan terbukti merusak agama dan kesehatan mental seseorang, maka menjaga jarak yang aman (*Al-Hajr Al-Jamil*—menjauh dengan cara yang santun) adalah tindakan yang disyariatkan.</w:t>
+        <w:t>Islam memandang silaturahmi bukan sebagai pemaksaan untuk bertahan dalam kezaliman. Jika sebuah hubungan terbukti merusak agama dan kesehatan mental seseorang, maka menjaga jarak yang aman (*Al-Hajr Al-Jamil*, menjauh dengan cara yang santun) adalah tindakan yang disyariatkan.</w:t>
       </w:r>
     </w:p>
     <w:tbl>
@@ -5423,7 +5407,7 @@
                 <w:color w:val="1B5E20"/>
                 <w:sz w:val="21"/>
               </w:rPr>
-              <w:t>🌿  Dialog Mindful: Membangun Pagar Damai di Sekeliling Jiwa</w:t>
+              <w:t>🌿 Dialog Mindful: Membangun Pagar Damai di Sekeliling Jiwa</w:t>
             </w:r>
           </w:p>
           <w:p>
@@ -5449,7 +5433,7 @@
                 <w:i/>
                 <w:sz w:val="21"/>
               </w:rPr>
-              <w:t>Letakkan telapak tangan kananmu di depan dada dengan jemari terbuka menghadap ke luar—isyarat sebuah pagar yang kokoh.</w:t>
+              <w:t>Letakkan telapak tangan kananmu di depan dada dengan jemari terbuka menghadap ke luar, isyarat sebuah pagar yang kokoh.</w:t>
             </w:r>
           </w:p>
           <w:p>
@@ -5641,7 +5625,7 @@
           <w:color w:val="787878"/>
           <w:sz w:val="20"/>
         </w:rPr>
-        <w:t>— ❖ —</w:t>
+        <w:t>❖</w:t>
       </w:r>
     </w:p>
     <w:tbl>
@@ -5724,7 +5708,7 @@
                 <w:color w:val="1B5E20"/>
                 <w:sz w:val="18"/>
               </w:rPr>
-              <w:t>— QS. An-Naba: 9-11</w:t>
+              <w:t>(QS. An-Naba: 9-11)</w:t>
             </w:r>
           </w:p>
           <w:p>
@@ -5765,7 +5749,7 @@
                 <w:color w:val="1B5E20"/>
                 <w:sz w:val="18"/>
               </w:rPr>
-              <w:t>— HR. Bukhari no. 6320 &amp; Muslim no. 2714</w:t>
+              <w:t>(HR. Bukhari no. 6320 &amp; Muslim no. 2714)</w:t>
             </w:r>
           </w:p>
         </w:tc>
@@ -5840,7 +5824,7 @@
           <w:color w:val="000000"/>
           <w:sz w:val="23"/>
         </w:rPr>
-        <w:t>Rasulullah SAW mengingatkan salah seorang sahabat mulia yang beribadah sepanjang malam tanpa tidur: *Inna li jasadika 'alaika haqqa*—'Sesungguhnya jasadmu memiliki hak atas dirimu yang wajib kau tunaikan!' (HR. Bukhari).</w:t>
+        <w:t>Rasulullah SAW mengingatkan salah seorang sahabat mulia yang beribadah sepanjang malam tanpa tidur: *Inna li jasadika 'alaika haqqa*, 'Sesungguhnya jasadmu memiliki hak atas dirimu yang wajib kau tunaikan!' (HR. Bukhari).</w:t>
       </w:r>
     </w:p>
     <w:p>
@@ -6009,7 +5993,7 @@
           <w:color w:val="000000"/>
           <w:sz w:val="22"/>
         </w:rPr>
-        <w:t>Lebih menakjubkan lagi, riset neurologi Universitas Rochester menemukan keberadaan 'Sistem Glimfatik' (Glymphatic System)—sistem pembersihan limbah metabolik di otak. Sistem ini 10 kali lipat lebih aktif saat manusia berada dalam tidur gelombang lambat (Deep Slow-Wave Sleep).</w:t>
+        <w:t>Lebih menakjubkan lagi, riset neurologi Universitas Rochester menemukan keberadaan 'Sistem Glimfatik' (Glymphatic System), sistem pembersihan limbah metabolik di otak. Sistem ini 10 kali lipat lebih aktif saat manusia berada dalam tidur gelombang lambat (Deep Slow-Wave Sleep).</w:t>
       </w:r>
     </w:p>
     <w:p>
@@ -6026,7 +6010,7 @@
           <w:color w:val="000000"/>
           <w:sz w:val="22"/>
         </w:rPr>
-        <w:t>Saat tidur nyenyak, cairan serebrospinal mengalir deras membilas plak racun beta-amiloid dan protein tau dari celah antar neuron otak—racun yang jika menumpuk akan memicu penurunan daya ingat, demensia, dan gangguan mood kronis. Istirahat fisik bukan kemunduran; ia adalah pembersihan biologis agar mesin otak berfungsi prima.</w:t>
+        <w:t>Saat tidur nyenyak, cairan serebrospinal mengalir deras membilas plak racun beta-amiloid dan protein tau dari celah antar neuron otak, racun yang jika menumpuk akan memicu penurunan daya ingat, demensia, dan gangguan mood kronis. Istirahat fisik bukan kemunduran; ia adalah pembersihan biologis agar mesin otak berfungsi prima.</w:t>
       </w:r>
     </w:p>
     <w:tbl>
@@ -6068,7 +6052,7 @@
                 <w:color w:val="1B5E20"/>
                 <w:sz w:val="21"/>
               </w:rPr>
-              <w:t>🌿  Dialog Mindful: Merebahkan Tubuh dalam Pelukan Rahmat-Nya</w:t>
+              <w:t>🌿 Dialog Mindful: Merebahkan Tubuh dalam Pelukan Rahmat-Nya</w:t>
             </w:r>
           </w:p>
           <w:p>
@@ -6304,7 +6288,7 @@
           <w:color w:val="787878"/>
           <w:sz w:val="19"/>
         </w:rPr>
-        <w:t>Inspirasi Kajian: Luka Akan Sembuh — Ustadz Salim A. Fillah, Hyung Hammad Rosyadi, &amp; Ustadz Amri Fatmi</w:t>
+        <w:t>Inspirasi Kajian: Luka Akan Sembuh, Ustadz Salim A. Fillah, Hyung Hammad Rosyadi, &amp; Ustadz Amri Fatmi</w:t>
       </w:r>
     </w:p>
     <w:p>
@@ -6373,7 +6357,7 @@
           <w:color w:val="787878"/>
           <w:sz w:val="20"/>
         </w:rPr>
-        <w:t>— ❖ —</w:t>
+        <w:t>❖</w:t>
       </w:r>
     </w:p>
     <w:tbl>
@@ -6456,7 +6440,7 @@
                 <w:color w:val="1B5E20"/>
                 <w:sz w:val="18"/>
               </w:rPr>
-              <w:t>— QS. Yusuf: 86</w:t>
+              <w:t>(QS. Yusuf: 86)</w:t>
             </w:r>
           </w:p>
           <w:p>
@@ -6497,7 +6481,7 @@
                 <w:color w:val="1B5E20"/>
                 <w:sz w:val="18"/>
               </w:rPr>
-              <w:t>— HR. Bukhari no. 5743 &amp; Muslim no. 2191</w:t>
+              <w:t>(HR. Bukhari no. 5743 &amp; Muslim no. 2191)</w:t>
             </w:r>
           </w:p>
         </w:tc>
@@ -6555,7 +6539,7 @@
           <w:color w:val="000000"/>
           <w:sz w:val="23"/>
         </w:rPr>
-        <w:t>Ada yang terluka karena pengkhianatan orang yang paling ia percaya. Ada yang memendam perih karena luka pengasuhan masa kecil—kata-kata kasar orang tua yang menancap di batin puluhan tahun lamanya. Ada yang hancur karena kegagalan besar yang meremukkan seluruh cita-cita masa mudanya.</w:t>
+        <w:t>Ada yang terluka karena pengkhianatan orang yang paling ia percaya. Ada yang memendam perih karena luka pengasuhan masa kecil, kata-kata kasar orang tua yang menancap di batin puluhan tahun lamanya. Ada yang hancur karena kegagalan besar yang meremukkan seluruh cita-cita masa mudanya.</w:t>
       </w:r>
     </w:p>
     <w:p>
@@ -6741,7 +6725,7 @@
           <w:color w:val="000000"/>
           <w:sz w:val="22"/>
         </w:rPr>
-        <w:t>Hyung Hammad Rosyadi dalam kajian 'Luka Akan Sembuh' menekankan tahapan 'Unmasking Grief'—memberi izin kepada diri sendiri untuk bersedih dan menangis tanpa rasa malu. Menangis bukanlah tanda kelemahan iman. Air mata adalah mekanisme biologis tubuh untuk membuang kelebihan hormon stres adrenokortikotropik (ACTH) melalui kelenjar lakrimal.</w:t>
+        <w:t>Hyung Hammad Rosyadi dalam kajian 'Luka Akan Sembuh' menekankan tahapan 'Unmasking Grief', memberi izin kepada diri sendiri untuk bersedih dan menangis tanpa rasa malu. Menangis bukanlah tanda kelemahan iman. Air mata adalah mekanisme biologis tubuh untuk membuang kelebihan hormon stres adrenokortikotropik (ACTH) melalui kelenjar lakrimal.</w:t>
       </w:r>
     </w:p>
     <w:p>
@@ -6800,7 +6784,7 @@
                 <w:color w:val="1B5E20"/>
                 <w:sz w:val="21"/>
               </w:rPr>
-              <w:t>🌿  Dialog Mindful: Menyentuh Luka dengan Kasih Sayang Ilahi</w:t>
+              <w:t>🌿 Dialog Mindful: Menyentuh Luka dengan Kasih Sayang Ilahi</w:t>
             </w:r>
           </w:p>
           <w:p>
@@ -7031,7 +7015,7 @@
           <w:color w:val="787878"/>
           <w:sz w:val="20"/>
         </w:rPr>
-        <w:t>— ❖ —</w:t>
+        <w:t>❖</w:t>
       </w:r>
     </w:p>
     <w:tbl>
@@ -7114,7 +7098,7 @@
                 <w:color w:val="1B5E20"/>
                 <w:sz w:val="18"/>
               </w:rPr>
-              <w:t>— QS. Al-Baqarah: 216</w:t>
+              <w:t>(QS. Al-Baqarah: 216)</w:t>
             </w:r>
           </w:p>
           <w:p>
@@ -7155,7 +7139,7 @@
                 <w:color w:val="1B5E20"/>
                 <w:sz w:val="18"/>
               </w:rPr>
-              <w:t>— HR. Ibnu Abi Dunya dalam Kitab Ar-Ridha</w:t>
+              <w:t>(HR. Ibnu Abi Dunya dalam Kitab Ar-Ridha)</w:t>
             </w:r>
           </w:p>
         </w:tc>
@@ -7247,7 +7231,7 @@
           <w:color w:val="000000"/>
           <w:sz w:val="23"/>
         </w:rPr>
-        <w:t>Dalam sesi kajian On The Way yang sangat berbobot dan berkelas, Dr. Ustadz Amri Fatmi—seorang ulama pakar Akidah dan Filsafat lulusan Universitas Al-Azhar Kairo—membedah simpul rumit ini dengan logika keimanan yang teramat memukau.</w:t>
+        <w:t>Dalam sesi kajian On The Way yang sangat berbobot dan berkelas, Dr. Ustadz Amri Fatmi, seorang ulama pakar Akidah dan Filsafat lulusan Universitas Al-Azhar Kairo, membedah simpul rumit ini dengan logika keimanan yang teramat memukau.</w:t>
       </w:r>
     </w:p>
     <w:p>
@@ -7332,7 +7316,7 @@
           <w:color w:val="000000"/>
           <w:sz w:val="23"/>
         </w:rPr>
-        <w:t>Pegang teguh kaidah emas yang diajarkan para ulama salaf ini: *Al-Khairah fima ikhtarahullah*—'Kebaikan yang sejati adalah apa pun yang telah dipilihkan oleh Allah untukmu, bukan apa yang dipilihkan oleh hawa nafsumu sendiri.' Kehilangan yang paling kau tangisi hari ini, suatu hari nanti akan kau syukuri sebagai bentuk perlindungan terbaik dari Tuhan yang menyelamatkanmu dari neraka dunia dan akhirat.</w:t>
+        <w:t>Pegang teguh kaidah emas yang diajarkan para ulama salaf ini: *Al-Khairah fima ikhtarahullah*, 'Kebaikan yang sejati adalah apa pun yang telah dipilihkan oleh Allah untukmu, bukan apa yang dipilihkan oleh hawa nafsumu sendiri.' Kehilangan yang paling kau tangisi hari ini, suatu hari nanti akan kau syukuri sebagai bentuk perlindungan terbaik dari Tuhan yang menyelamatkanmu dari neraka dunia dan akhirat.</w:t>
       </w:r>
     </w:p>
     <w:p>
@@ -7365,7 +7349,7 @@
           <w:color w:val="000000"/>
           <w:sz w:val="22"/>
         </w:rPr>
-        <w:t>Psikologi kognitif modern menekankan pentingnya 'Cognitive Reframing' (Pembingkaian Ulang Kognitif)—proses mengidentifikasi dan mengubah cara seseorang memandang sebuah peristiwa krisis agar makna yang dihasilkan menjadi adaptif dan memberdayakan.</w:t>
+        <w:t>Psikologi kognitif modern menekankan pentingnya 'Cognitive Reframing' (Pembingkaian Ulang Kognitif), proses mengidentifikasi dan mengubah cara seseorang memandang sebuah peristiwa krisis agar makna yang dihasilkan menjadi adaptif dan memberdayakan.</w:t>
       </w:r>
     </w:p>
     <w:p>
@@ -7475,7 +7459,7 @@
                 <w:color w:val="1B5E20"/>
                 <w:sz w:val="21"/>
               </w:rPr>
-              <w:t>🌿  Dialog Mindful: Menyerahkan Hak Menghakimi kepada Allah</w:t>
+              <w:t>🌿 Dialog Mindful: Menyerahkan Hak Menghakimi kepada Allah</w:t>
             </w:r>
           </w:p>
           <w:p>
@@ -7706,7 +7690,7 @@
           <w:color w:val="787878"/>
           <w:sz w:val="20"/>
         </w:rPr>
-        <w:t>— ❖ —</w:t>
+        <w:t>❖</w:t>
       </w:r>
     </w:p>
     <w:tbl>
@@ -7789,7 +7773,7 @@
                 <w:color w:val="1B5E20"/>
                 <w:sz w:val="18"/>
               </w:rPr>
-              <w:t>— QS. An-Nur: 22</w:t>
+              <w:t>(QS. An-Nur: 22)</w:t>
             </w:r>
           </w:p>
           <w:p>
@@ -7830,7 +7814,7 @@
                 <w:color w:val="1B5E20"/>
                 <w:sz w:val="18"/>
               </w:rPr>
-              <w:t>— QS. Al-Hasyr: 10</w:t>
+              <w:t>(QS. Al-Hasyr: 10)</w:t>
             </w:r>
           </w:p>
         </w:tc>
@@ -8150,7 +8134,7 @@
                 <w:color w:val="1B5E20"/>
                 <w:sz w:val="21"/>
               </w:rPr>
-              <w:t>🌿  Dialog Mindful: Melepaskan Tali Kekang Dendam</w:t>
+              <w:t>🌿 Dialog Mindful: Melepaskan Tali Kekang Dendam</w:t>
             </w:r>
           </w:p>
           <w:p>
@@ -8394,7 +8378,7 @@
           <w:color w:val="787878"/>
           <w:sz w:val="20"/>
         </w:rPr>
-        <w:t>— ❖ —</w:t>
+        <w:t>❖</w:t>
       </w:r>
     </w:p>
     <w:tbl>
@@ -8477,7 +8461,7 @@
                 <w:color w:val="1B5E20"/>
                 <w:sz w:val="18"/>
               </w:rPr>
-              <w:t>— QS. Al-Insyirah: 5-8</w:t>
+              <w:t>(QS. Al-Insyirah: 5-8)</w:t>
             </w:r>
           </w:p>
           <w:p>
@@ -8518,7 +8502,7 @@
                 <w:color w:val="1B5E20"/>
                 <w:sz w:val="18"/>
               </w:rPr>
-              <w:t>— HR. Muslim no. 918 (Doa Ummu Salamah)</w:t>
+              <w:t>(HR. Muslim no. 918 (Doa Ummu Salamah))</w:t>
             </w:r>
           </w:p>
         </w:tc>
@@ -8787,7 +8771,7 @@
           <w:color w:val="000000"/>
           <w:sz w:val="22"/>
         </w:rPr>
-        <w:t>Janji Al-Qur'an terbukti presisi secara ilmiah dan psikologis: 'Inna ma'al 'usri yusra'—sesungguhnya bersama kesulitan itu ada kemudahan yang menyertainya. Kata kemudahan (*al-yusr*) disebutkan dalam bentuk definitif (ma'rifah), sedangkan kesulitan (*al-'usr*) dalam bentuk indefinitif (nakirah), menandakan bahwa satu kesulitan tidak akan pernah mampu mengalahkan dua kemudahan yang berlipat ganda.</w:t>
+        <w:t>Janji Al-Qur'an terbukti presisi secara ilmiah dan psikologis: 'Inna ma'al 'usri yusra', sesungguhnya bersama kesulitan itu ada kemudahan yang menyertainya. Kata kemudahan (*al-yusr*) disebutkan dalam bentuk definitif (ma'rifah), sedangkan kesulitan (*al-'usr*) dalam bentuk indefinitif (nakirah), menandakan bahwa satu kesulitan tidak akan pernah mampu mengalahkan dua kemudahan yang berlipat ganda.</w:t>
       </w:r>
     </w:p>
     <w:tbl>
@@ -8829,7 +8813,7 @@
                 <w:color w:val="1B5E20"/>
                 <w:sz w:val="21"/>
               </w:rPr>
-              <w:t>🌿  Dialog Mindful: Merayakan Jiwa yang Telah Utuh Kembali</w:t>
+              <w:t>🌿 Dialog Mindful: Merayakan Jiwa yang Telah Utuh Kembali</w:t>
             </w:r>
           </w:p>
           <w:p>
@@ -9031,7 +9015,7 @@
           <w:color w:val="787878"/>
           <w:sz w:val="20"/>
         </w:rPr>
-        <w:t>— ❖ —</w:t>
+        <w:t>❖</w:t>
       </w:r>
     </w:p>
     <w:p>
@@ -9099,7 +9083,7 @@
           <w:color w:val="000000"/>
           <w:sz w:val="23"/>
         </w:rPr>
-        <w:t>Kita juga telah berani mengambil jeda taktis—meneladani para pemuda gua Ashabul Kahfi yang memilih menepi demi menjaga kemurnian iman dan kewarasan akal budi. Kita telah belajar membangun benteng batasan diri yang kokoh, berani berkata tidak pada hal-hal yang meracuni batin, dan memuliakan hak tubuh kita untuk beristirahat tanpa disiksa oleh rasa bersalah.</w:t>
+        <w:t>Kita juga telah berani mengambil jeda taktis, meneladani para pemuda gua Ashabul Kahfi yang memilih menepi demi menjaga kemurnian iman dan kewarasan akal budi. Kita telah belajar membangun benteng batasan diri yang kokoh, berani berkata tidak pada hal-hal yang meracuni batin, dan memuliakan hak tubuh kita untuk beristirahat tanpa disiksa oleh rasa bersalah.</w:t>
       </w:r>
     </w:p>
     <w:p>
@@ -9361,7 +9345,7 @@
                 <w:b/>
                 <w:sz w:val="22"/>
               </w:rPr>
-              <w:t>[  ]</w:t>
+              <w:t>[ ]</w:t>
             </w:r>
           </w:p>
         </w:tc>
@@ -9450,7 +9434,7 @@
                 <w:b/>
                 <w:sz w:val="22"/>
               </w:rPr>
-              <w:t>[  ]</w:t>
+              <w:t>[ ]</w:t>
             </w:r>
           </w:p>
         </w:tc>
@@ -9539,7 +9523,7 @@
                 <w:b/>
                 <w:sz w:val="22"/>
               </w:rPr>
-              <w:t>[  ]</w:t>
+              <w:t>[ ]</w:t>
             </w:r>
           </w:p>
         </w:tc>
@@ -9628,7 +9612,7 @@
                 <w:b/>
                 <w:sz w:val="22"/>
               </w:rPr>
-              <w:t>[  ]</w:t>
+              <w:t>[ ]</w:t>
             </w:r>
           </w:p>
         </w:tc>
@@ -9717,7 +9701,7 @@
                 <w:b/>
                 <w:sz w:val="22"/>
               </w:rPr>
-              <w:t>[  ]</w:t>
+              <w:t>[ ]</w:t>
             </w:r>
           </w:p>
         </w:tc>
@@ -9936,7 +9920,7 @@
                 <w:b/>
                 <w:sz w:val="22"/>
               </w:rPr>
-              <w:t>[  ]</w:t>
+              <w:t>[ ]</w:t>
             </w:r>
           </w:p>
         </w:tc>
@@ -10025,7 +10009,7 @@
                 <w:b/>
                 <w:sz w:val="22"/>
               </w:rPr>
-              <w:t>[  ]</w:t>
+              <w:t>[ ]</w:t>
             </w:r>
           </w:p>
         </w:tc>
@@ -10114,7 +10098,7 @@
                 <w:b/>
                 <w:sz w:val="22"/>
               </w:rPr>
-              <w:t>[  ]</w:t>
+              <w:t>[ ]</w:t>
             </w:r>
           </w:p>
         </w:tc>
@@ -10203,7 +10187,7 @@
                 <w:b/>
                 <w:sz w:val="22"/>
               </w:rPr>
-              <w:t>[  ]</w:t>
+              <w:t>[ ]</w:t>
             </w:r>
           </w:p>
         </w:tc>
@@ -10292,7 +10276,7 @@
                 <w:b/>
                 <w:sz w:val="22"/>
               </w:rPr>
-              <w:t>[  ]</w:t>
+              <w:t>[ ]</w:t>
             </w:r>
           </w:p>
         </w:tc>
@@ -10511,7 +10495,7 @@
                 <w:b/>
                 <w:sz w:val="22"/>
               </w:rPr>
-              <w:t>[  ]</w:t>
+              <w:t>[ ]</w:t>
             </w:r>
           </w:p>
         </w:tc>
@@ -10600,7 +10584,7 @@
                 <w:b/>
                 <w:sz w:val="22"/>
               </w:rPr>
-              <w:t>[  ]</w:t>
+              <w:t>[ ]</w:t>
             </w:r>
           </w:p>
         </w:tc>
@@ -10689,7 +10673,7 @@
                 <w:b/>
                 <w:sz w:val="22"/>
               </w:rPr>
-              <w:t>[  ]</w:t>
+              <w:t>[ ]</w:t>
             </w:r>
           </w:p>
         </w:tc>
@@ -10778,7 +10762,7 @@
                 <w:b/>
                 <w:sz w:val="22"/>
               </w:rPr>
-              <w:t>[  ]</w:t>
+              <w:t>[ ]</w:t>
             </w:r>
           </w:p>
         </w:tc>
@@ -10867,7 +10851,7 @@
                 <w:b/>
                 <w:sz w:val="22"/>
               </w:rPr>
-              <w:t>[  ]</w:t>
+              <w:t>[ ]</w:t>
             </w:r>
           </w:p>
         </w:tc>
@@ -11055,7 +11039,7 @@
                 <w:rFonts w:ascii="Garamond" w:hAnsi="Garamond"/>
                 <w:sz w:val="19"/>
               </w:rPr>
-              <w:t xml:space="preserve">   ....................................................................................................................................................................................</w:t>
+              <w:t>....................................................................................................................................................................................</w:t>
             </w:r>
           </w:p>
           <w:p>
@@ -11067,7 +11051,7 @@
                 <w:rFonts w:ascii="Garamond" w:hAnsi="Garamond"/>
                 <w:sz w:val="19"/>
               </w:rPr>
-              <w:t xml:space="preserve">   ....................................................................................................................................................................................</w:t>
+              <w:t>....................................................................................................................................................................................</w:t>
             </w:r>
           </w:p>
           <w:p>
@@ -11091,7 +11075,7 @@
                 <w:rFonts w:ascii="Garamond" w:hAnsi="Garamond"/>
                 <w:sz w:val="19"/>
               </w:rPr>
-              <w:t xml:space="preserve">   ....................................................................................................................................................................................</w:t>
+              <w:t>....................................................................................................................................................................................</w:t>
             </w:r>
           </w:p>
           <w:p>
@@ -11103,7 +11087,7 @@
                 <w:rFonts w:ascii="Garamond" w:hAnsi="Garamond"/>
                 <w:sz w:val="19"/>
               </w:rPr>
-              <w:t xml:space="preserve">   ....................................................................................................................................................................................</w:t>
+              <w:t>....................................................................................................................................................................................</w:t>
             </w:r>
           </w:p>
           <w:p>
@@ -11127,7 +11111,7 @@
                 <w:rFonts w:ascii="Garamond" w:hAnsi="Garamond"/>
                 <w:sz w:val="19"/>
               </w:rPr>
-              <w:t xml:space="preserve">   ....................................................................................................................................................................................</w:t>
+              <w:t>....................................................................................................................................................................................</w:t>
             </w:r>
           </w:p>
           <w:p>
@@ -11139,7 +11123,7 @@
                 <w:rFonts w:ascii="Garamond" w:hAnsi="Garamond"/>
                 <w:sz w:val="19"/>
               </w:rPr>
-              <w:t xml:space="preserve">   ....................................................................................................................................................................................</w:t>
+              <w:t>....................................................................................................................................................................................</w:t>
             </w:r>
           </w:p>
           <w:p>
@@ -11163,7 +11147,7 @@
                 <w:rFonts w:ascii="Garamond" w:hAnsi="Garamond"/>
                 <w:sz w:val="19"/>
               </w:rPr>
-              <w:t xml:space="preserve">   ....................................................................................................................................................................................</w:t>
+              <w:t>....................................................................................................................................................................................</w:t>
             </w:r>
           </w:p>
         </w:tc>
@@ -11283,7 +11267,7 @@
                 <w:rFonts w:ascii="Garamond" w:hAnsi="Garamond"/>
                 <w:sz w:val="19"/>
               </w:rPr>
-              <w:t xml:space="preserve">   ....................................................................................................................................................................................</w:t>
+              <w:t>....................................................................................................................................................................................</w:t>
             </w:r>
           </w:p>
           <w:p>
@@ -11295,7 +11279,7 @@
                 <w:rFonts w:ascii="Garamond" w:hAnsi="Garamond"/>
                 <w:sz w:val="19"/>
               </w:rPr>
-              <w:t xml:space="preserve">   ....................................................................................................................................................................................</w:t>
+              <w:t>....................................................................................................................................................................................</w:t>
             </w:r>
           </w:p>
           <w:p>
@@ -11319,7 +11303,7 @@
                 <w:rFonts w:ascii="Garamond" w:hAnsi="Garamond"/>
                 <w:sz w:val="19"/>
               </w:rPr>
-              <w:t xml:space="preserve">   ....................................................................................................................................................................................</w:t>
+              <w:t>....................................................................................................................................................................................</w:t>
             </w:r>
           </w:p>
           <w:p>
@@ -11343,7 +11327,7 @@
                 <w:rFonts w:ascii="Garamond" w:hAnsi="Garamond"/>
                 <w:sz w:val="19"/>
               </w:rPr>
-              <w:t xml:space="preserve">   ....................................................................................................................................................................................</w:t>
+              <w:t>....................................................................................................................................................................................</w:t>
             </w:r>
           </w:p>
           <w:p>
@@ -11355,7 +11339,7 @@
                 <w:rFonts w:ascii="Garamond" w:hAnsi="Garamond"/>
                 <w:sz w:val="19"/>
               </w:rPr>
-              <w:t xml:space="preserve">   ....................................................................................................................................................................................</w:t>
+              <w:t>....................................................................................................................................................................................</w:t>
             </w:r>
           </w:p>
           <w:p>
@@ -11379,7 +11363,7 @@
                 <w:rFonts w:ascii="Garamond" w:hAnsi="Garamond"/>
                 <w:sz w:val="19"/>
               </w:rPr>
-              <w:t xml:space="preserve">   ....................................................................................................................................................................................</w:t>
+              <w:t>....................................................................................................................................................................................</w:t>
             </w:r>
           </w:p>
           <w:p>
@@ -11391,7 +11375,7 @@
                 <w:rFonts w:ascii="Garamond" w:hAnsi="Garamond"/>
                 <w:sz w:val="19"/>
               </w:rPr>
-              <w:t xml:space="preserve">   ....................................................................................................................................................................................</w:t>
+              <w:t>....................................................................................................................................................................................</w:t>
             </w:r>
           </w:p>
           <w:p>
@@ -11635,7 +11619,7 @@
           <w:color w:val="505050"/>
           <w:sz w:val="18"/>
         </w:rPr>
-        <w:t>Signifikansi Riset: Merumuskan kerangka empiris Post-Traumatic Growth (PTG)—bagaimana krisis berat dapat memicu pertumbuhan karakter dan kedalaman spiritual yang melampaui kondisi sebelum trauma.</w:t>
+        <w:t>Signifikansi Riset: Merumuskan kerangka empiris Post-Traumatic Growth (PTG), bagaimana krisis berat dapat memicu pertumbuhan karakter dan kedalaman spiritual yang melampaui kondisi sebelum trauma.</w:t>
       </w:r>
     </w:p>
     <w:p>
@@ -11878,7 +11862,7 @@
                 <w:color w:val="1B5E20"/>
                 <w:sz w:val="21"/>
               </w:rPr>
-              <w:t>📺 QR CODE 2: KAJIAN 1 — WHEN THE HEART IS LONELY</w:t>
+              <w:t>📺 QR CODE 2: KAJIAN 1, WHEN THE HEART IS LONELY</w:t>
             </w:r>
           </w:p>
           <w:p>
@@ -12015,7 +11999,7 @@
                 <w:color w:val="1B5E20"/>
                 <w:sz w:val="21"/>
               </w:rPr>
-              <w:t>📺 QR CODE 3: KAJIAN 2 — KABUR AJA DULU (MENGHADAPI BURNOUT)</w:t>
+              <w:t>📺 QR CODE 3: KAJIAN 2, KABUR AJA DULU (MENGHADAPI BURNOUT)</w:t>
             </w:r>
           </w:p>
           <w:p>
@@ -12131,7 +12115,7 @@
                 <w:color w:val="1B5E20"/>
                 <w:sz w:val="21"/>
               </w:rPr>
-              <w:t>📺 QR CODE 4: KAJIAN 3 — LUKA AKAN SEMBUH (PEMULIHAN TRAUMA)</w:t>
+              <w:t>📺 QR CODE 4: KAJIAN 3, LUKA AKAN SEMBUH (PEMULIHAN TRAUMA)</w:t>
             </w:r>
           </w:p>
           <w:p>
@@ -12227,23 +12211,7 @@
       <w:pStyle w:val="Footer"/>
       <w:jc w:val="center"/>
     </w:pPr>
-    <w:r>
-      <w:rPr>
-        <w:rFonts w:ascii="Garamond" w:hAnsi="Garamond"/>
-        <w:color w:val="787878"/>
-        <w:sz w:val="18"/>
-      </w:rPr>
-      <w:t xml:space="preserve">— </w:t>
-    </w:r>
     <w:fldSimple w:instr="PAGE"/>
-    <w:r>
-      <w:rPr>
-        <w:rFonts w:ascii="Garamond" w:hAnsi="Garamond"/>
-        <w:color w:val="787878"/>
-        <w:sz w:val="18"/>
-      </w:rPr>
-      <w:t xml:space="preserve"> —</w:t>
-    </w:r>
   </w:p>
 </w:ftr>
 </file>

</xml_diff>

<commit_message>
feat: add notebook template generator and update QR code layout logic in book builder
</commit_message>
<xml_diff>
--- a/result/Ketika_Jiwa_Pulang_ke_Sunyi.docx
+++ b/result/Ketika_Jiwa_Pulang_ke_Sunyi.docx
@@ -11780,13 +11780,13 @@
     </w:tbl>
     <w:p>
       <w:pPr>
-        <w:spacing w:after="120"/>
+        <w:spacing w:after="160" w:before="80"/>
         <w:jc w:val="center"/>
       </w:pPr>
       <w:r>
         <w:drawing>
           <wp:inline xmlns:a="http://schemas.openxmlformats.org/drawingml/2006/main" xmlns:pic="http://schemas.openxmlformats.org/drawingml/2006/picture">
-            <wp:extent cx="1280160" cy="1280160"/>
+            <wp:extent cx="1371600" cy="1371600"/>
             <wp:docPr id="1" name="Picture 1"/>
             <wp:cNvGraphicFramePr>
               <a:graphicFrameLocks noChangeAspect="1"/>
@@ -11807,7 +11807,7 @@
                   <pic:spPr>
                     <a:xfrm>
                       <a:off x="0" y="0"/>
-                      <a:ext cx="1280160" cy="1280160"/>
+                      <a:ext cx="1371600" cy="1371600"/>
                     </a:xfrm>
                     <a:prstGeom prst="rect"/>
                   </pic:spPr>
@@ -11822,6 +11822,27 @@
       <w:pPr>
         <w:spacing w:after="80"/>
       </w:pPr>
+    </w:p>
+    <w:p>
+      <w:r>
+        <w:br w:type="page"/>
+      </w:r>
+    </w:p>
+    <w:p>
+      <w:pPr>
+        <w:spacing w:before="0" w:after="240" w:line="300" w:lineRule="auto"/>
+        <w:jc w:val="center"/>
+      </w:pPr>
+      <w:r>
+        <w:rPr>
+          <w:rFonts w:ascii="Garamond" w:hAnsi="Garamond"/>
+          <w:b/>
+          <w:i w:val="0"/>
+          <w:color w:val="1B5E20"/>
+          <w:sz w:val="24"/>
+        </w:rPr>
+        <w:t>INTEGRASI DIGITAL &amp; KODE QR PENDUKUNG (LANJUTAN)</w:t>
+      </w:r>
     </w:p>
     <w:tbl>
       <w:tblPr>
@@ -11896,13 +11917,13 @@
     </w:tbl>
     <w:p>
       <w:pPr>
-        <w:spacing w:after="120"/>
+        <w:spacing w:after="160" w:before="80"/>
         <w:jc w:val="center"/>
       </w:pPr>
       <w:r>
         <w:drawing>
           <wp:inline xmlns:a="http://schemas.openxmlformats.org/drawingml/2006/main" xmlns:pic="http://schemas.openxmlformats.org/drawingml/2006/picture">
-            <wp:extent cx="1280160" cy="1280160"/>
+            <wp:extent cx="1371600" cy="1371600"/>
             <wp:docPr id="2" name="Picture 2"/>
             <wp:cNvGraphicFramePr>
               <a:graphicFrameLocks noChangeAspect="1"/>
@@ -11923,7 +11944,7 @@
                   <pic:spPr>
                     <a:xfrm>
                       <a:off x="0" y="0"/>
-                      <a:ext cx="1280160" cy="1280160"/>
+                      <a:ext cx="1371600" cy="1371600"/>
                     </a:xfrm>
                     <a:prstGeom prst="rect"/>
                   </pic:spPr>
@@ -12033,13 +12054,13 @@
     </w:tbl>
     <w:p>
       <w:pPr>
-        <w:spacing w:after="120"/>
+        <w:spacing w:after="160" w:before="80"/>
         <w:jc w:val="center"/>
       </w:pPr>
       <w:r>
         <w:drawing>
           <wp:inline xmlns:a="http://schemas.openxmlformats.org/drawingml/2006/main" xmlns:pic="http://schemas.openxmlformats.org/drawingml/2006/picture">
-            <wp:extent cx="1280160" cy="1280160"/>
+            <wp:extent cx="1371600" cy="1371600"/>
             <wp:docPr id="3" name="Picture 3"/>
             <wp:cNvGraphicFramePr>
               <a:graphicFrameLocks noChangeAspect="1"/>
@@ -12060,7 +12081,7 @@
                   <pic:spPr>
                     <a:xfrm>
                       <a:off x="0" y="0"/>
-                      <a:ext cx="1280160" cy="1280160"/>
+                      <a:ext cx="1371600" cy="1371600"/>
                     </a:xfrm>
                     <a:prstGeom prst="rect"/>
                   </pic:spPr>
@@ -12075,6 +12096,27 @@
       <w:pPr>
         <w:spacing w:after="80"/>
       </w:pPr>
+    </w:p>
+    <w:p>
+      <w:r>
+        <w:br w:type="page"/>
+      </w:r>
+    </w:p>
+    <w:p>
+      <w:pPr>
+        <w:spacing w:before="0" w:after="240" w:line="300" w:lineRule="auto"/>
+        <w:jc w:val="center"/>
+      </w:pPr>
+      <w:r>
+        <w:rPr>
+          <w:rFonts w:ascii="Garamond" w:hAnsi="Garamond"/>
+          <w:b/>
+          <w:i w:val="0"/>
+          <w:color w:val="1B5E20"/>
+          <w:sz w:val="24"/>
+        </w:rPr>
+        <w:t>INTEGRASI DIGITAL &amp; KODE QR PENDUKUNG (LANJUTAN)</w:t>
+      </w:r>
     </w:p>
     <w:tbl>
       <w:tblPr>
@@ -12149,13 +12191,13 @@
     </w:tbl>
     <w:p>
       <w:pPr>
-        <w:spacing w:after="120"/>
+        <w:spacing w:after="160" w:before="80"/>
         <w:jc w:val="center"/>
       </w:pPr>
       <w:r>
         <w:drawing>
           <wp:inline xmlns:a="http://schemas.openxmlformats.org/drawingml/2006/main" xmlns:pic="http://schemas.openxmlformats.org/drawingml/2006/picture">
-            <wp:extent cx="1280160" cy="1280160"/>
+            <wp:extent cx="1371600" cy="1371600"/>
             <wp:docPr id="4" name="Picture 4"/>
             <wp:cNvGraphicFramePr>
               <a:graphicFrameLocks noChangeAspect="1"/>
@@ -12176,7 +12218,7 @@
                   <pic:spPr>
                     <a:xfrm>
                       <a:off x="0" y="0"/>
-                      <a:ext cx="1280160" cy="1280160"/>
+                      <a:ext cx="1371600" cy="1371600"/>
                     </a:xfrm>
                     <a:prstGeom prst="rect"/>
                   </pic:spPr>

</xml_diff>

<commit_message>
fix: improve pagination layout by enforcing keep-with-next and keep-together constraints on tag, question, and answer line elements
</commit_message>
<xml_diff>
--- a/result/Ketika_Jiwa_Pulang_ke_Sunyi.docx
+++ b/result/Ketika_Jiwa_Pulang_ke_Sunyi.docx
@@ -18418,6 +18418,7 @@
           </w:tcPr>
           <w:p>
             <w:pPr>
+              <w:keepNext/>
               <w:spacing w:after="0"/>
             </w:pPr>
             <w:r>
@@ -18435,6 +18436,7 @@
     </w:tbl>
     <w:p>
       <w:pPr>
+        <w:keepNext/>
         <w:spacing w:before="60" w:after="40" w:line="312" w:lineRule="auto"/>
       </w:pPr>
       <w:r>
@@ -18449,6 +18451,8 @@
     </w:p>
     <w:p>
       <w:pPr>
+        <w:keepNext/>
+        <w:keepLines/>
         <w:tabs>
           <w:tab w:val="right" w:leader="dot" w:pos="5896"/>
         </w:tabs>
@@ -18460,6 +18464,7 @@
     </w:p>
     <w:p>
       <w:pPr>
+        <w:keepLines/>
         <w:tabs>
           <w:tab w:val="right" w:leader="dot" w:pos="5896"/>
         </w:tabs>
@@ -18498,6 +18503,7 @@
           </w:tcPr>
           <w:p>
             <w:pPr>
+              <w:keepNext/>
               <w:spacing w:after="0"/>
             </w:pPr>
             <w:r>
@@ -18515,6 +18521,7 @@
     </w:tbl>
     <w:p>
       <w:pPr>
+        <w:keepNext/>
         <w:spacing w:before="60" w:after="40" w:line="312" w:lineRule="auto"/>
       </w:pPr>
       <w:r>
@@ -18538,6 +18545,8 @@
     </w:p>
     <w:p>
       <w:pPr>
+        <w:keepNext/>
+        <w:keepLines/>
         <w:tabs>
           <w:tab w:val="right" w:leader="dot" w:pos="5896"/>
         </w:tabs>
@@ -18549,6 +18558,7 @@
     </w:p>
     <w:p>
       <w:pPr>
+        <w:keepLines/>
         <w:tabs>
           <w:tab w:val="right" w:leader="dot" w:pos="5896"/>
         </w:tabs>
@@ -18587,6 +18597,7 @@
           </w:tcPr>
           <w:p>
             <w:pPr>
+              <w:keepNext/>
               <w:spacing w:after="0"/>
             </w:pPr>
             <w:r>
@@ -18596,6 +18607,7 @@
                 <w:color w:val="FFFFFF"/>
                 <w:sz w:val="17"/>
               </w:rPr>
+              <w:lastRenderedPageBreak/>
               <w:t xml:space="preserve">  BATASAN DIRI &amp; KETENANGAN (BOUNDARY)  </w:t>
             </w:r>
           </w:p>
@@ -18604,6 +18616,7 @@
     </w:tbl>
     <w:p>
       <w:pPr>
+        <w:keepNext/>
         <w:spacing w:before="60" w:after="40" w:line="312" w:lineRule="auto"/>
       </w:pPr>
       <w:r>
@@ -18618,18 +18631,20 @@
     </w:p>
     <w:p>
       <w:pPr>
+        <w:keepNext/>
+        <w:keepLines/>
         <w:tabs>
           <w:tab w:val="right" w:leader="dot" w:pos="5896"/>
         </w:tabs>
         <w:spacing w:after="80" w:line="384" w:lineRule="auto"/>
       </w:pPr>
       <w:r>
-        <w:lastRenderedPageBreak/>
         <w:tab/>
       </w:r>
     </w:p>
     <w:p>
       <w:pPr>
+        <w:keepLines/>
         <w:tabs>
           <w:tab w:val="right" w:leader="dot" w:pos="5896"/>
         </w:tabs>
@@ -18668,6 +18683,7 @@
           </w:tcPr>
           <w:p>
             <w:pPr>
+              <w:keepNext/>
               <w:spacing w:after="0"/>
             </w:pPr>
             <w:r>
@@ -18685,6 +18701,7 @@
     </w:tbl>
     <w:p>
       <w:pPr>
+        <w:keepNext/>
         <w:spacing w:before="60" w:after="40" w:line="312" w:lineRule="auto"/>
       </w:pPr>
       <w:r>
@@ -18708,6 +18725,8 @@
     </w:p>
     <w:p>
       <w:pPr>
+        <w:keepNext/>
+        <w:keepLines/>
         <w:tabs>
           <w:tab w:val="right" w:leader="dot" w:pos="5896"/>
         </w:tabs>
@@ -18719,6 +18738,7 @@
     </w:p>
     <w:p>
       <w:pPr>
+        <w:keepLines/>
         <w:tabs>
           <w:tab w:val="right" w:leader="dot" w:pos="5896"/>
         </w:tabs>
@@ -19099,6 +19119,7 @@
           </w:tcPr>
           <w:p>
             <w:pPr>
+              <w:keepNext/>
               <w:spacing w:after="0"/>
             </w:pPr>
             <w:r>
@@ -19116,6 +19137,7 @@
     </w:tbl>
     <w:p>
       <w:pPr>
+        <w:keepNext/>
         <w:spacing w:before="60" w:after="40" w:line="312" w:lineRule="auto"/>
       </w:pPr>
       <w:r>
@@ -19139,6 +19161,8 @@
     </w:p>
     <w:p>
       <w:pPr>
+        <w:keepNext/>
+        <w:keepLines/>
         <w:tabs>
           <w:tab w:val="right" w:leader="dot" w:pos="5896"/>
         </w:tabs>
@@ -19150,6 +19174,7 @@
     </w:p>
     <w:p>
       <w:pPr>
+        <w:keepLines/>
         <w:tabs>
           <w:tab w:val="right" w:leader="dot" w:pos="5896"/>
         </w:tabs>
@@ -19188,6 +19213,7 @@
           </w:tcPr>
           <w:p>
             <w:pPr>
+              <w:keepNext/>
               <w:spacing w:after="0"/>
             </w:pPr>
             <w:r>
@@ -19205,6 +19231,7 @@
     </w:tbl>
     <w:p>
       <w:pPr>
+        <w:keepNext/>
         <w:spacing w:before="60" w:after="40" w:line="312" w:lineRule="auto"/>
       </w:pPr>
       <w:r>
@@ -19219,6 +19246,8 @@
     </w:p>
     <w:p>
       <w:pPr>
+        <w:keepNext/>
+        <w:keepLines/>
         <w:tabs>
           <w:tab w:val="right" w:leader="dot" w:pos="5896"/>
         </w:tabs>
@@ -19230,6 +19259,7 @@
     </w:p>
     <w:p>
       <w:pPr>
+        <w:keepLines/>
         <w:tabs>
           <w:tab w:val="right" w:leader="dot" w:pos="5896"/>
         </w:tabs>
@@ -19268,6 +19298,7 @@
           </w:tcPr>
           <w:p>
             <w:pPr>
+              <w:keepNext/>
               <w:spacing w:after="0"/>
             </w:pPr>
             <w:r>
@@ -19277,6 +19308,7 @@
                 <w:color w:val="FFFFFF"/>
                 <w:sz w:val="17"/>
               </w:rPr>
+              <w:lastRenderedPageBreak/>
               <w:t xml:space="preserve">  HIKMAH EMAS PASCA BADAI (KINTSUGI)  </w:t>
             </w:r>
           </w:p>
@@ -19285,6 +19317,7 @@
     </w:tbl>
     <w:p>
       <w:pPr>
+        <w:keepNext/>
         <w:spacing w:before="60" w:after="40" w:line="312" w:lineRule="auto"/>
       </w:pPr>
       <w:r>
@@ -19308,18 +19341,20 @@
     </w:p>
     <w:p>
       <w:pPr>
+        <w:keepNext/>
+        <w:keepLines/>
         <w:tabs>
           <w:tab w:val="right" w:leader="dot" w:pos="5896"/>
         </w:tabs>
         <w:spacing w:after="80" w:line="384" w:lineRule="auto"/>
       </w:pPr>
       <w:r>
-        <w:lastRenderedPageBreak/>
         <w:tab/>
       </w:r>
     </w:p>
     <w:p>
       <w:pPr>
+        <w:keepLines/>
         <w:tabs>
           <w:tab w:val="right" w:leader="dot" w:pos="5896"/>
         </w:tabs>
@@ -19358,6 +19393,7 @@
           </w:tcPr>
           <w:p>
             <w:pPr>
+              <w:keepNext/>
               <w:spacing w:after="0"/>
             </w:pPr>
             <w:r>
@@ -19375,6 +19411,7 @@
     </w:tbl>
     <w:p>
       <w:pPr>
+        <w:keepNext/>
         <w:spacing w:before="60" w:after="40" w:line="312" w:lineRule="auto"/>
       </w:pPr>
       <w:r>
@@ -19389,6 +19426,8 @@
     </w:p>
     <w:p>
       <w:pPr>
+        <w:keepNext/>
+        <w:keepLines/>
         <w:tabs>
           <w:tab w:val="right" w:leader="dot" w:pos="5896"/>
         </w:tabs>
@@ -19400,6 +19439,7 @@
     </w:p>
     <w:p>
       <w:pPr>
+        <w:keepLines/>
         <w:tabs>
           <w:tab w:val="right" w:leader="dot" w:pos="5896"/>
         </w:tabs>
@@ -19573,7 +19613,15 @@
           <w:color w:val="1B5E20"/>
           <w:sz w:val="17"/>
         </w:rPr>
-        <w:t>DOI Resmi: https://doi.org/10.1371/journal.pmed.1000316</w:t>
+        <w:t xml:space="preserve">DOI Resmi: </w:t>
+      </w:r>
+      <w:r>
+        <w:rPr>
+          <w:rFonts w:ascii="Garamond" w:hAnsi="Garamond"/>
+          <w:color w:val="1B5E20"/>
+          <w:sz w:val="17"/>
+        </w:rPr>
+        <w:t>https://doi.org/10.1371/journal.pmed.1000316</w:t>
       </w:r>
     </w:p>
     <w:p>
@@ -19588,8 +19636,52 @@
           <w:color w:val="505050"/>
           <w:sz w:val="18"/>
         </w:rPr>
-        <w:t xml:space="preserve">Signifikansi Riset: </w:t>
-      </w:r>
+        <w:t>Signifikansi Riset: Membuktikan bahwa isolasi sosial dan kesepian kronis meningkatkan risiko mortalitas dini setara dengan merokok 15 batang rokok per hari.</w:t>
+      </w:r>
+    </w:p>
+    <w:p>
+      <w:pPr>
+        <w:spacing w:after="20" w:line="300" w:lineRule="auto"/>
+        <w:jc w:val="both"/>
+      </w:pPr>
+      <w:r>
+        <w:rPr>
+          <w:rFonts w:ascii="Garamond" w:hAnsi="Garamond"/>
+          <w:b/>
+          <w:color w:val="000000"/>
+          <w:sz w:val="19"/>
+        </w:rPr>
+        <w:t xml:space="preserve">[2] Eisenberger, N. I., Lieberman, M. D., &amp; </w:t>
+      </w:r>
+      <w:r>
+        <w:rPr>
+          <w:rFonts w:ascii="Garamond" w:hAnsi="Garamond"/>
+          <w:b/>
+          <w:color w:val="000000"/>
+          <w:sz w:val="19"/>
+        </w:rPr>
+        <w:t>Williams, K. D. (2003). Does rejection hurt? An fMRI study of social exclusion. Science, 302(5643), 290-292.</w:t>
+      </w:r>
+    </w:p>
+    <w:p>
+      <w:pPr>
+        <w:spacing w:after="20" w:line="300" w:lineRule="auto"/>
+        <w:jc w:val="both"/>
+      </w:pPr>
+      <w:r>
+        <w:rPr>
+          <w:rFonts w:ascii="Garamond" w:hAnsi="Garamond"/>
+          <w:color w:val="1B5E20"/>
+          <w:sz w:val="17"/>
+        </w:rPr>
+        <w:t>DOI Resmi: https://doi.org/10.1126/science.1089134</w:t>
+      </w:r>
+    </w:p>
+    <w:p>
+      <w:pPr>
+        <w:spacing w:after="160" w:line="300" w:lineRule="auto"/>
+        <w:jc w:val="both"/>
+      </w:pPr>
       <w:r>
         <w:rPr>
           <w:rFonts w:ascii="Garamond" w:hAnsi="Garamond"/>
@@ -19597,52 +19689,8 @@
           <w:color w:val="505050"/>
           <w:sz w:val="18"/>
         </w:rPr>
-        <w:t>Membuktikan bahwa isolasi sosial dan kesepian kronis meningkatkan risiko mortalitas dini setara dengan merokok 15 batang rokok per hari.</w:t>
-      </w:r>
-    </w:p>
-    <w:p>
-      <w:pPr>
-        <w:spacing w:after="20" w:line="300" w:lineRule="auto"/>
-        <w:jc w:val="both"/>
-      </w:pPr>
-      <w:r>
-        <w:rPr>
-          <w:rFonts w:ascii="Garamond" w:hAnsi="Garamond"/>
-          <w:b/>
-          <w:color w:val="000000"/>
-          <w:sz w:val="19"/>
-        </w:rPr>
-        <w:t>[2] Eisenberger, N. I., Lieberman, M. D., &amp; Williams, K. D. (2003). Does rejection hurt? An fMRI study of social exclus</w:t>
-      </w:r>
-      <w:r>
-        <w:rPr>
-          <w:rFonts w:ascii="Garamond" w:hAnsi="Garamond"/>
-          <w:b/>
-          <w:color w:val="000000"/>
-          <w:sz w:val="19"/>
-        </w:rPr>
-        <w:t>ion. Science, 302(5643), 290-292.</w:t>
-      </w:r>
-    </w:p>
-    <w:p>
-      <w:pPr>
-        <w:spacing w:after="20" w:line="300" w:lineRule="auto"/>
-        <w:jc w:val="both"/>
-      </w:pPr>
-      <w:r>
-        <w:rPr>
-          <w:rFonts w:ascii="Garamond" w:hAnsi="Garamond"/>
-          <w:color w:val="1B5E20"/>
-          <w:sz w:val="17"/>
-        </w:rPr>
-        <w:t>DOI Resmi: https://doi.org/10.1126/science.1089134</w:t>
-      </w:r>
-    </w:p>
-    <w:p>
-      <w:pPr>
-        <w:spacing w:after="160" w:line="300" w:lineRule="auto"/>
-        <w:jc w:val="both"/>
-      </w:pPr>
+        <w:t>Signifikansi Riset: Menemukan bahwa rasa sakit akibat penolakan sosial diproses pada substrat sa</w:t>
+      </w:r>
       <w:r>
         <w:rPr>
           <w:rFonts w:ascii="Garamond" w:hAnsi="Garamond"/>
@@ -19650,8 +19698,51 @@
           <w:color w:val="505050"/>
           <w:sz w:val="18"/>
         </w:rPr>
-        <w:t xml:space="preserve">Signifikansi Riset: Menemukan bahwa rasa sakit akibat penolakan sosial diproses pada substrat saraf yang sama dengan rasa sakit fisik (Dorsal Anterior Cingulate </w:t>
-      </w:r>
+        <w:t>raf yang sama dengan rasa sakit fisik (Dorsal Anterior Cingulate Cortex).</w:t>
+      </w:r>
+    </w:p>
+    <w:p>
+      <w:pPr>
+        <w:spacing w:after="20" w:line="300" w:lineRule="auto"/>
+        <w:jc w:val="both"/>
+      </w:pPr>
+      <w:r>
+        <w:rPr>
+          <w:rFonts w:ascii="Garamond" w:hAnsi="Garamond"/>
+          <w:b/>
+          <w:color w:val="000000"/>
+          <w:sz w:val="19"/>
+        </w:rPr>
+        <w:t>[3] Porges, S. W. (2011). The Polyvagal Theory: Neurophysiological Foundations of Emotions, Attachment, Communication, and Self-regulation. W. W. Norton &amp; Company.</w:t>
+      </w:r>
+    </w:p>
+    <w:p>
+      <w:pPr>
+        <w:spacing w:after="20" w:line="300" w:lineRule="auto"/>
+        <w:jc w:val="both"/>
+      </w:pPr>
+      <w:r>
+        <w:rPr>
+          <w:rFonts w:ascii="Garamond" w:hAnsi="Garamond"/>
+          <w:color w:val="1B5E20"/>
+          <w:sz w:val="17"/>
+        </w:rPr>
+        <w:t>DOI Resmi: https:/</w:t>
+      </w:r>
+      <w:r>
+        <w:rPr>
+          <w:rFonts w:ascii="Garamond" w:hAnsi="Garamond"/>
+          <w:color w:val="1B5E20"/>
+          <w:sz w:val="17"/>
+        </w:rPr>
+        <w:t>/doi.org/10.1037/e570882012-001</w:t>
+      </w:r>
+    </w:p>
+    <w:p>
+      <w:pPr>
+        <w:spacing w:after="160" w:line="300" w:lineRule="auto"/>
+        <w:jc w:val="both"/>
+      </w:pPr>
       <w:r>
         <w:rPr>
           <w:rFonts w:ascii="Garamond" w:hAnsi="Garamond"/>
@@ -19659,7 +19750,7 @@
           <w:color w:val="505050"/>
           <w:sz w:val="18"/>
         </w:rPr>
-        <w:t>Cortex).</w:t>
+        <w:t>Signifikansi Riset: Menjelaskan mekanisme biologis Saraf Vagus dalam mengatur respons keamanan sosial (*Ventral Vagal*), pemulihan trauma, dan ketenangan batin.</w:t>
       </w:r>
     </w:p>
     <w:p>
@@ -19674,7 +19765,16 @@
           <w:color w:val="000000"/>
           <w:sz w:val="19"/>
         </w:rPr>
-        <w:t>[3] Porges, S. W. (2011). The Polyvagal Theory: Neurophysiological Foundations of Emotions, Attachment, Communication, and Self-regulation. W. W. Norton &amp; Company.</w:t>
+        <w:t>[4] Tedeschi, R. G., &amp; Calhoun, L. G. (2004). Posttraumatic Gro</w:t>
+      </w:r>
+      <w:r>
+        <w:rPr>
+          <w:rFonts w:ascii="Garamond" w:hAnsi="Garamond"/>
+          <w:b/>
+          <w:color w:val="000000"/>
+          <w:sz w:val="19"/>
+        </w:rPr>
+        <w:t>wth: Conceptual Foundations and Empirical Evidence. Psychological Inquiry, 15(1), 1-18.</w:t>
       </w:r>
     </w:p>
     <w:p>
@@ -19688,7 +19788,7 @@
           <w:color w:val="1B5E20"/>
           <w:sz w:val="17"/>
         </w:rPr>
-        <w:t>DOI Resmi: https://doi.org/10.1037/e570882012-001</w:t>
+        <w:t>DOI Resmi: https://doi.org/10.1207/s15327965pli1501_01</w:t>
       </w:r>
     </w:p>
     <w:p>
@@ -19703,7 +19803,7 @@
           <w:color w:val="505050"/>
           <w:sz w:val="18"/>
         </w:rPr>
-        <w:t>Signifikansi Riset: Menjelaskan m</w:t>
+        <w:t xml:space="preserve">Signifikansi Riset: Merumuskan kerangka empiris Post-Traumatic Growth (PTG), bagaimana krisis berat dapat memicu </w:t>
       </w:r>
       <w:r>
         <w:rPr>
@@ -19712,7 +19812,7 @@
           <w:color w:val="505050"/>
           <w:sz w:val="18"/>
         </w:rPr>
-        <w:t>ekanisme biologis Saraf Vagus dalam mengatur respons keamanan sosial (*Ventral Vagal*), pemulihan trauma, dan ketenangan batin.</w:t>
+        <w:t>pertumbuhan karakter dan kedalaman spiritual yang melampaui kondisi sebelum trauma.</w:t>
       </w:r>
     </w:p>
     <w:p>
@@ -19727,16 +19827,7 @@
           <w:color w:val="000000"/>
           <w:sz w:val="19"/>
         </w:rPr>
-        <w:t>[4] Tedeschi, R. G., &amp; Calhoun, L. G. (2004). Posttraumatic Growth: Conceptual Foundations and Empirical Evidence. Psychological</w:t>
-      </w:r>
-      <w:r>
-        <w:rPr>
-          <w:rFonts w:ascii="Garamond" w:hAnsi="Garamond"/>
-          <w:b/>
-          <w:color w:val="000000"/>
-          <w:sz w:val="19"/>
-        </w:rPr>
-        <w:t xml:space="preserve"> Inquiry, 15(1), 1-18.</w:t>
+        <w:t>[5] Xie, L., Kang, H., Xu, Q., et al. (2013). Sleep drives metabolite clearance from the adult brain. Science, 342(6156), 373-377.</w:t>
       </w:r>
     </w:p>
     <w:p>
@@ -19750,7 +19841,15 @@
           <w:color w:val="1B5E20"/>
           <w:sz w:val="17"/>
         </w:rPr>
-        <w:t>DOI Resmi: https://doi.org/10.1207/s15327965pli1501_01</w:t>
+        <w:t>DOI Resmi: https://doi.org/10.1126/scienc</w:t>
+      </w:r>
+      <w:r>
+        <w:rPr>
+          <w:rFonts w:ascii="Garamond" w:hAnsi="Garamond"/>
+          <w:color w:val="1B5E20"/>
+          <w:sz w:val="17"/>
+        </w:rPr>
+        <w:t>e.1241224</w:t>
       </w:r>
     </w:p>
     <w:p>
@@ -19765,69 +19864,7 @@
           <w:color w:val="505050"/>
           <w:sz w:val="18"/>
         </w:rPr>
-        <w:t>Signifikansi Riset: Merumuskan kerangka empiris Post-Traumatic Growth (PTG), bagaimana krisis berat dapat memicu pertumbuhan karakter dan kedalaman spiritual yang melampaui kondi</w:t>
-      </w:r>
-      <w:r>
-        <w:rPr>
-          <w:rFonts w:ascii="Garamond" w:hAnsi="Garamond"/>
-          <w:i/>
-          <w:color w:val="505050"/>
-          <w:sz w:val="18"/>
-        </w:rPr>
-        <w:t>si sebelum trauma.</w:t>
-      </w:r>
-    </w:p>
-    <w:p>
-      <w:pPr>
-        <w:spacing w:after="20" w:line="300" w:lineRule="auto"/>
-        <w:jc w:val="both"/>
-      </w:pPr>
-      <w:r>
-        <w:rPr>
-          <w:rFonts w:ascii="Garamond" w:hAnsi="Garamond"/>
-          <w:b/>
-          <w:color w:val="000000"/>
-          <w:sz w:val="19"/>
-        </w:rPr>
-        <w:t>[5] Xie, L., Kang, H., Xu, Q., et al. (2013). Sleep drives metabolite clearance from the adult brain. Science, 342(6156), 373-377.</w:t>
-      </w:r>
-    </w:p>
-    <w:p>
-      <w:pPr>
-        <w:spacing w:after="20" w:line="300" w:lineRule="auto"/>
-        <w:jc w:val="both"/>
-      </w:pPr>
-      <w:r>
-        <w:rPr>
-          <w:rFonts w:ascii="Garamond" w:hAnsi="Garamond"/>
-          <w:color w:val="1B5E20"/>
-          <w:sz w:val="17"/>
-        </w:rPr>
-        <w:t>DOI Resmi: https://doi.org/10.1126/science.1241224</w:t>
-      </w:r>
-    </w:p>
-    <w:p>
-      <w:pPr>
-        <w:spacing w:after="160" w:line="300" w:lineRule="auto"/>
-        <w:jc w:val="both"/>
-      </w:pPr>
-      <w:r>
-        <w:rPr>
-          <w:rFonts w:ascii="Garamond" w:hAnsi="Garamond"/>
-          <w:i/>
-          <w:color w:val="505050"/>
-          <w:sz w:val="18"/>
-        </w:rPr>
-        <w:t>Signifikansi Riset: Menemukan fungsi Sistem Glimfatik o</w:t>
-      </w:r>
-      <w:r>
-        <w:rPr>
-          <w:rFonts w:ascii="Garamond" w:hAnsi="Garamond"/>
-          <w:i/>
-          <w:color w:val="505050"/>
-          <w:sz w:val="18"/>
-        </w:rPr>
-        <w:t>tak yang membersihkan racun metabolik (beta-amiloid) 10 kali lipat lebih efektif selama fase tidur gelombang lambat.</w:t>
+        <w:t>Signifikansi Riset: Menemukan fungsi Sistem Glimfatik otak yang membersihkan racun metabolik (beta-amiloid) 10 kali lipat lebih efektif selama fase tidur gelombang lambat.</w:t>
       </w:r>
     </w:p>
     <w:p>
@@ -19863,7 +19900,15 @@
           <w:color w:val="000000"/>
           <w:sz w:val="20"/>
         </w:rPr>
-        <w:t>Pindai QR Code untuk konsultasi AI Assistant atau menyaksikan video sumber:</w:t>
+        <w:t>Pindai QR Code untuk konsultasi AI</w:t>
+      </w:r>
+      <w:r>
+        <w:rPr>
+          <w:rFonts w:ascii="Garamond" w:hAnsi="Garamond"/>
+          <w:color w:val="000000"/>
+          <w:sz w:val="20"/>
+        </w:rPr>
+        <w:t xml:space="preserve"> Assistant atau menyaksikan video sumber:</w:t>
       </w:r>
     </w:p>
     <w:tbl>
@@ -19917,16 +19962,7 @@
                 <w:color w:val="1B5E20"/>
                 <w:sz w:val="21"/>
               </w:rPr>
-              <w:t xml:space="preserve"> QR CODE 1: AI ASSIST</w:t>
-            </w:r>
-            <w:r>
-              <w:rPr>
-                <w:rFonts w:ascii="Garamond" w:hAnsi="Garamond"/>
-                <w:b/>
-                <w:color w:val="1B5E20"/>
-                <w:sz w:val="21"/>
-              </w:rPr>
-              <w:t>ANT CHATBOT KESEHATAN MENTAL &amp; PENATAAN HATI</w:t>
+              <w:t xml:space="preserve"> QR CODE 1: AI ASSISTANT CHATBOT KESEHATAN MENTAL &amp; PENATAAN HATI</w:t>
             </w:r>
           </w:p>
           <w:p>
@@ -19950,14 +19986,14 @@
                 <w:rFonts w:ascii="Garamond" w:hAnsi="Garamond"/>
                 <w:sz w:val="21"/>
               </w:rPr>
-              <w:t>Tautan Resmi: https://chatgpt.com/?q=Konsultasi+Kesehatan+Mental+dan+Penataan+Hati+Isla</w:t>
+              <w:t>Tautan Resmi: https://</w:t>
             </w:r>
             <w:r>
               <w:rPr>
                 <w:rFonts w:ascii="Garamond" w:hAnsi="Garamond"/>
                 <w:sz w:val="21"/>
               </w:rPr>
-              <w:t>mi</w:t>
+              <w:t>chatgpt.com/?q=Konsultasi+Kesehatan+Mental+dan+Penataan+Hati+Islami</w:t>
             </w:r>
           </w:p>
         </w:tc>
@@ -19973,7 +20009,7 @@
           <w:noProof/>
         </w:rPr>
         <w:drawing>
-          <wp:inline distT="0" distB="0" distL="0" distR="0" wp14:anchorId="1688DA7A" wp14:editId="1B32287B">
+          <wp:inline distT="0" distB="0" distL="0" distR="0" wp14:anchorId="4E372F07" wp14:editId="3613F5A3">
             <wp:extent cx="1371600" cy="1371600"/>
             <wp:effectExtent l="0" t="0" r="0" b="0"/>
             <wp:docPr id="1" name="Picture 1"/>
@@ -20098,7 +20134,14 @@
                 <w:rFonts w:ascii="Garamond" w:hAnsi="Garamond"/>
                 <w:sz w:val="21"/>
               </w:rPr>
-              <w:t>Pindai QR Code ini untuk menonton rekaman video kajian lengkap Habib Isa Alkaff, Habib Ja'far Al Jufri, dan Bang Fathur.</w:t>
+              <w:t xml:space="preserve">Pindai QR Code ini untuk menonton rekaman video kajian lengkap Habib Isa </w:t>
+            </w:r>
+            <w:r>
+              <w:rPr>
+                <w:rFonts w:ascii="Garamond" w:hAnsi="Garamond"/>
+                <w:sz w:val="21"/>
+              </w:rPr>
+              <w:t>Alkaff, Habib Ja'far Al Jufri, dan Bang Fathur.</w:t>
             </w:r>
           </w:p>
           <w:p>
@@ -20110,14 +20153,7 @@
                 <w:rFonts w:ascii="Garamond" w:hAnsi="Garamond"/>
                 <w:sz w:val="21"/>
               </w:rPr>
-              <w:t xml:space="preserve">Tautan Resmi: </w:t>
-            </w:r>
-            <w:r>
-              <w:rPr>
-                <w:rFonts w:ascii="Garamond" w:hAnsi="Garamond"/>
-                <w:sz w:val="21"/>
-              </w:rPr>
-              <w:t>https://www.youtube.com/watch?v=YV0DoIaRESE</w:t>
+              <w:t>Tautan Resmi: https://www.youtube.com/watch?v=YV0DoIaRESE</w:t>
             </w:r>
           </w:p>
         </w:tc>
@@ -20133,7 +20169,7 @@
           <w:noProof/>
         </w:rPr>
         <w:drawing>
-          <wp:inline distT="0" distB="0" distL="0" distR="0" wp14:anchorId="6E47A5F6" wp14:editId="4DB6BFCF">
+          <wp:inline distT="0" distB="0" distL="0" distR="0" wp14:anchorId="36C33CBE" wp14:editId="7AFE0648">
             <wp:extent cx="1371600" cy="1371600"/>
             <wp:effectExtent l="0" t="0" r="0" b="0"/>
             <wp:docPr id="2" name="Picture 2"/>
@@ -20258,14 +20294,14 @@
                 <w:rFonts w:ascii="Garamond" w:hAnsi="Garamond"/>
                 <w:sz w:val="21"/>
               </w:rPr>
-              <w:t xml:space="preserve">Pindai QR Code ini untuk menonton kajian mendalam Habib Ja'far Al Jufri dan Ustadz Fikri </w:t>
+              <w:t xml:space="preserve">Pindai QR Code ini untuk </w:t>
             </w:r>
             <w:r>
               <w:rPr>
                 <w:rFonts w:ascii="Garamond" w:hAnsi="Garamond"/>
                 <w:sz w:val="21"/>
               </w:rPr>
-              <w:t>Nadjib tentang burnout &amp; uzlah.</w:t>
+              <w:t>menonton kajian mendalam Habib Ja'far Al Jufri dan Ustadz Fikri Nadjib tentang burnout &amp; uzlah.</w:t>
             </w:r>
           </w:p>
           <w:p>
@@ -20293,7 +20329,7 @@
           <w:noProof/>
         </w:rPr>
         <w:drawing>
-          <wp:inline distT="0" distB="0" distL="0" distR="0" wp14:anchorId="76E94256" wp14:editId="6DA2CAC9">
+          <wp:inline distT="0" distB="0" distL="0" distR="0" wp14:anchorId="7E44005F" wp14:editId="11CF4569">
             <wp:extent cx="1371600" cy="1371600"/>
             <wp:effectExtent l="0" t="0" r="0" b="0"/>
             <wp:docPr id="3" name="Picture 3"/>
@@ -20406,7 +20442,16 @@
                 <w:color w:val="1B5E20"/>
                 <w:sz w:val="21"/>
               </w:rPr>
-              <w:t xml:space="preserve"> QR CODE 4: KAJIAN 3, LUKA AKAN SEMBUH (PEMULIHAN TRAUMA)</w:t>
+              <w:t xml:space="preserve"> QR CODE 4: KAJIAN 3, LUKA AKAN SEMBUH </w:t>
+            </w:r>
+            <w:r>
+              <w:rPr>
+                <w:rFonts w:ascii="Garamond" w:hAnsi="Garamond"/>
+                <w:b/>
+                <w:color w:val="1B5E20"/>
+                <w:sz w:val="21"/>
+              </w:rPr>
+              <w:t>(PEMULIHAN TRAUMA)</w:t>
             </w:r>
           </w:p>
           <w:p>
@@ -20418,14 +20463,7 @@
                 <w:rFonts w:ascii="Garamond" w:hAnsi="Garamond"/>
                 <w:sz w:val="21"/>
               </w:rPr>
-              <w:t xml:space="preserve">Pindai QR Code ini untuk menyimak petuah </w:t>
-            </w:r>
-            <w:r>
-              <w:rPr>
-                <w:rFonts w:ascii="Garamond" w:hAnsi="Garamond"/>
-                <w:sz w:val="21"/>
-              </w:rPr>
-              <w:t>syahdu Ustadz Salim A. Fillah, Hyung Hammad Rosyadi, dan Ustadz Dr. Amri Fatmi.</w:t>
+              <w:t>Pindai QR Code ini untuk menyimak petuah syahdu Ustadz Salim A. Fillah, Hyung Hammad Rosyadi, dan Ustadz Dr. Amri Fatmi.</w:t>
             </w:r>
           </w:p>
           <w:p>
@@ -20453,7 +20491,7 @@
           <w:noProof/>
         </w:rPr>
         <w:drawing>
-          <wp:inline distT="0" distB="0" distL="0" distR="0" wp14:anchorId="194A7071" wp14:editId="57C8566C">
+          <wp:inline distT="0" distB="0" distL="0" distR="0" wp14:anchorId="57A67B39" wp14:editId="28D22EBF">
             <wp:extent cx="1371600" cy="1371600"/>
             <wp:effectExtent l="0" t="0" r="0" b="0"/>
             <wp:docPr id="4" name="Picture 4"/>

</xml_diff>

<commit_message>
refactor: remove thin rule separators from book layout structure
</commit_message>
<xml_diff>
--- a/result/Ketika_Jiwa_Pulang_ke_Sunyi.docx
+++ b/result/Ketika_Jiwa_Pulang_ke_Sunyi.docx
@@ -41,20 +41,6 @@
     </w:p>
     <w:p>
       <w:pPr>
-        <w:spacing w:before="0" w:after="360"/>
-        <w:jc w:val="center"/>
-      </w:pPr>
-      <w:r>
-        <w:rPr>
-          <w:rFonts w:ascii="Garamond" w:hAnsi="Garamond"/>
-          <w:color w:val="919191"/>
-          <w:sz w:val="16"/>
-        </w:rPr>
-        <w:t>────────────────────────────</w:t>
-      </w:r>
-    </w:p>
-    <w:p>
-      <w:pPr>
         <w:spacing w:before="0" w:after="80" w:line="324" w:lineRule="auto"/>
         <w:jc w:val="center"/>
       </w:pPr>
@@ -879,20 +865,6 @@
     </w:p>
     <w:p>
       <w:pPr>
-        <w:spacing w:before="0" w:after="200"/>
-        <w:jc w:val="center"/>
-      </w:pPr>
-      <w:r>
-        <w:rPr>
-          <w:rFonts w:ascii="Garamond" w:hAnsi="Garamond"/>
-          <w:color w:val="919191"/>
-          <w:sz w:val="16"/>
-        </w:rPr>
-        <w:t>────────────────────────────</w:t>
-      </w:r>
-    </w:p>
-    <w:p>
-      <w:pPr>
         <w:spacing w:before="0" w:after="120" w:line="324" w:lineRule="auto"/>
         <w:jc w:val="center"/>
       </w:pPr>
@@ -962,20 +934,6 @@
     </w:p>
     <w:p>
       <w:pPr>
-        <w:spacing w:before="0" w:after="320"/>
-        <w:jc w:val="center"/>
-      </w:pPr>
-      <w:r>
-        <w:rPr>
-          <w:rFonts w:ascii="Garamond" w:hAnsi="Garamond"/>
-          <w:color w:val="919191"/>
-          <w:sz w:val="16"/>
-        </w:rPr>
-        <w:t>────────────────────────────</w:t>
-      </w:r>
-    </w:p>
-    <w:p>
-      <w:pPr>
         <w:spacing w:before="200" w:after="80" w:line="432" w:lineRule="auto"/>
         <w:jc w:val="right"/>
       </w:pPr>
@@ -1068,20 +1026,6 @@
     </w:p>
     <w:p>
       <w:pPr>
-        <w:spacing w:before="80" w:after="280"/>
-        <w:jc w:val="center"/>
-      </w:pPr>
-      <w:r>
-        <w:rPr>
-          <w:rFonts w:ascii="Garamond" w:hAnsi="Garamond"/>
-          <w:color w:val="919191"/>
-          <w:sz w:val="16"/>
-        </w:rPr>
-        <w:t>────────────────────────────</w:t>
-      </w:r>
-    </w:p>
-    <w:p>
-      <w:pPr>
         <w:spacing w:before="0" w:after="120" w:line="324" w:lineRule="auto"/>
         <w:ind w:firstLine="283"/>
         <w:jc w:val="both"/>
@@ -1274,20 +1218,6 @@
     </w:p>
     <w:p>
       <w:pPr>
-        <w:spacing w:before="160" w:after="120"/>
-        <w:jc w:val="center"/>
-      </w:pPr>
-      <w:r>
-        <w:rPr>
-          <w:rFonts w:ascii="Garamond" w:hAnsi="Garamond"/>
-          <w:color w:val="919191"/>
-          <w:sz w:val="16"/>
-        </w:rPr>
-        <w:t>────────────────────────────</w:t>
-      </w:r>
-    </w:p>
-    <w:p>
-      <w:pPr>
         <w:spacing w:before="120" w:after="200" w:line="312" w:lineRule="auto"/>
         <w:ind w:left="454" w:right="454"/>
         <w:jc w:val="both"/>
@@ -1357,20 +1287,6 @@
     </w:p>
     <w:p>
       <w:pPr>
-        <w:spacing w:before="0" w:after="320"/>
-        <w:jc w:val="center"/>
-      </w:pPr>
-      <w:r>
-        <w:rPr>
-          <w:rFonts w:ascii="Garamond" w:hAnsi="Garamond"/>
-          <w:color w:val="919191"/>
-          <w:sz w:val="16"/>
-        </w:rPr>
-        <w:t>────────────────────────────</w:t>
-      </w:r>
-    </w:p>
-    <w:p>
-      <w:pPr>
         <w:spacing w:before="200" w:after="80" w:line="432" w:lineRule="auto"/>
         <w:jc w:val="right"/>
       </w:pPr>
@@ -1463,20 +1379,6 @@
     </w:p>
     <w:p>
       <w:pPr>
-        <w:spacing w:before="80" w:after="280"/>
-        <w:jc w:val="center"/>
-      </w:pPr>
-      <w:r>
-        <w:rPr>
-          <w:rFonts w:ascii="Garamond" w:hAnsi="Garamond"/>
-          <w:color w:val="919191"/>
-          <w:sz w:val="16"/>
-        </w:rPr>
-        <w:t>────────────────────────────</w:t>
-      </w:r>
-    </w:p>
-    <w:p>
-      <w:pPr>
         <w:spacing w:before="0" w:after="120" w:line="324" w:lineRule="auto"/>
         <w:ind w:firstLine="283"/>
         <w:jc w:val="both"/>
@@ -1686,20 +1588,6 @@
     </w:p>
     <w:p>
       <w:pPr>
-        <w:spacing w:before="160" w:after="120"/>
-        <w:jc w:val="center"/>
-      </w:pPr>
-      <w:r>
-        <w:rPr>
-          <w:rFonts w:ascii="Garamond" w:hAnsi="Garamond"/>
-          <w:color w:val="919191"/>
-          <w:sz w:val="16"/>
-        </w:rPr>
-        <w:t>────────────────────────────</w:t>
-      </w:r>
-    </w:p>
-    <w:p>
-      <w:pPr>
         <w:spacing w:before="120" w:after="200" w:line="312" w:lineRule="auto"/>
         <w:ind w:left="454" w:right="454"/>
         <w:jc w:val="both"/>
@@ -1769,20 +1657,6 @@
     </w:p>
     <w:p>
       <w:pPr>
-        <w:spacing w:before="0" w:after="320"/>
-        <w:jc w:val="center"/>
-      </w:pPr>
-      <w:r>
-        <w:rPr>
-          <w:rFonts w:ascii="Garamond" w:hAnsi="Garamond"/>
-          <w:color w:val="919191"/>
-          <w:sz w:val="16"/>
-        </w:rPr>
-        <w:t>────────────────────────────</w:t>
-      </w:r>
-    </w:p>
-    <w:p>
-      <w:pPr>
         <w:spacing w:before="200" w:after="80" w:line="432" w:lineRule="auto"/>
         <w:jc w:val="right"/>
       </w:pPr>
@@ -1875,20 +1749,6 @@
     </w:p>
     <w:p>
       <w:pPr>
-        <w:spacing w:before="80" w:after="280"/>
-        <w:jc w:val="center"/>
-      </w:pPr>
-      <w:r>
-        <w:rPr>
-          <w:rFonts w:ascii="Garamond" w:hAnsi="Garamond"/>
-          <w:color w:val="919191"/>
-          <w:sz w:val="16"/>
-        </w:rPr>
-        <w:t>────────────────────────────</w:t>
-      </w:r>
-    </w:p>
-    <w:p>
-      <w:pPr>
         <w:spacing w:before="0" w:after="120" w:line="324" w:lineRule="auto"/>
         <w:ind w:firstLine="283"/>
         <w:jc w:val="both"/>
@@ -2115,20 +1975,6 @@
     </w:p>
     <w:p>
       <w:pPr>
-        <w:spacing w:before="160" w:after="120"/>
-        <w:jc w:val="center"/>
-      </w:pPr>
-      <w:r>
-        <w:rPr>
-          <w:rFonts w:ascii="Garamond" w:hAnsi="Garamond"/>
-          <w:color w:val="919191"/>
-          <w:sz w:val="16"/>
-        </w:rPr>
-        <w:t>────────────────────────────</w:t>
-      </w:r>
-    </w:p>
-    <w:p>
-      <w:pPr>
         <w:spacing w:before="120" w:after="200" w:line="312" w:lineRule="auto"/>
         <w:ind w:left="454" w:right="454"/>
         <w:jc w:val="both"/>
@@ -2198,20 +2044,6 @@
     </w:p>
     <w:p>
       <w:pPr>
-        <w:spacing w:before="0" w:after="320"/>
-        <w:jc w:val="center"/>
-      </w:pPr>
-      <w:r>
-        <w:rPr>
-          <w:rFonts w:ascii="Garamond" w:hAnsi="Garamond"/>
-          <w:color w:val="919191"/>
-          <w:sz w:val="16"/>
-        </w:rPr>
-        <w:t>────────────────────────────</w:t>
-      </w:r>
-    </w:p>
-    <w:p>
-      <w:pPr>
         <w:spacing w:before="200" w:after="80" w:line="432" w:lineRule="auto"/>
         <w:jc w:val="right"/>
       </w:pPr>
@@ -2304,20 +2136,6 @@
     </w:p>
     <w:p>
       <w:pPr>
-        <w:spacing w:before="80" w:after="280"/>
-        <w:jc w:val="center"/>
-      </w:pPr>
-      <w:r>
-        <w:rPr>
-          <w:rFonts w:ascii="Garamond" w:hAnsi="Garamond"/>
-          <w:color w:val="919191"/>
-          <w:sz w:val="16"/>
-        </w:rPr>
-        <w:t>────────────────────────────</w:t>
-      </w:r>
-    </w:p>
-    <w:p>
-      <w:pPr>
         <w:spacing w:before="0" w:after="120" w:line="324" w:lineRule="auto"/>
         <w:ind w:firstLine="283"/>
         <w:jc w:val="both"/>
@@ -2544,20 +2362,6 @@
     </w:p>
     <w:p>
       <w:pPr>
-        <w:spacing w:before="160" w:after="120"/>
-        <w:jc w:val="center"/>
-      </w:pPr>
-      <w:r>
-        <w:rPr>
-          <w:rFonts w:ascii="Garamond" w:hAnsi="Garamond"/>
-          <w:color w:val="919191"/>
-          <w:sz w:val="16"/>
-        </w:rPr>
-        <w:t>────────────────────────────</w:t>
-      </w:r>
-    </w:p>
-    <w:p>
-      <w:pPr>
         <w:spacing w:before="120" w:after="200" w:line="312" w:lineRule="auto"/>
         <w:ind w:left="454" w:right="454"/>
         <w:jc w:val="both"/>
@@ -2632,20 +2436,6 @@
     </w:p>
     <w:p>
       <w:pPr>
-        <w:spacing w:before="0" w:after="200"/>
-        <w:jc w:val="center"/>
-      </w:pPr>
-      <w:r>
-        <w:rPr>
-          <w:rFonts w:ascii="Garamond" w:hAnsi="Garamond"/>
-          <w:color w:val="919191"/>
-          <w:sz w:val="16"/>
-        </w:rPr>
-        <w:t>────────────────────────────</w:t>
-      </w:r>
-    </w:p>
-    <w:p>
-      <w:pPr>
         <w:spacing w:before="0" w:after="120" w:line="324" w:lineRule="auto"/>
         <w:jc w:val="center"/>
       </w:pPr>
@@ -2715,20 +2505,6 @@
     </w:p>
     <w:p>
       <w:pPr>
-        <w:spacing w:before="0" w:after="320"/>
-        <w:jc w:val="center"/>
-      </w:pPr>
-      <w:r>
-        <w:rPr>
-          <w:rFonts w:ascii="Garamond" w:hAnsi="Garamond"/>
-          <w:color w:val="919191"/>
-          <w:sz w:val="16"/>
-        </w:rPr>
-        <w:t>────────────────────────────</w:t>
-      </w:r>
-    </w:p>
-    <w:p>
-      <w:pPr>
         <w:spacing w:before="200" w:after="80" w:line="432" w:lineRule="auto"/>
         <w:jc w:val="right"/>
       </w:pPr>
@@ -2821,20 +2597,6 @@
     </w:p>
     <w:p>
       <w:pPr>
-        <w:spacing w:before="80" w:after="280"/>
-        <w:jc w:val="center"/>
-      </w:pPr>
-      <w:r>
-        <w:rPr>
-          <w:rFonts w:ascii="Garamond" w:hAnsi="Garamond"/>
-          <w:color w:val="919191"/>
-          <w:sz w:val="16"/>
-        </w:rPr>
-        <w:t>────────────────────────────</w:t>
-      </w:r>
-    </w:p>
-    <w:p>
-      <w:pPr>
         <w:spacing w:before="0" w:after="120" w:line="324" w:lineRule="auto"/>
         <w:ind w:firstLine="283"/>
         <w:jc w:val="both"/>
@@ -3044,20 +2806,6 @@
     </w:p>
     <w:p>
       <w:pPr>
-        <w:spacing w:before="160" w:after="120"/>
-        <w:jc w:val="center"/>
-      </w:pPr>
-      <w:r>
-        <w:rPr>
-          <w:rFonts w:ascii="Garamond" w:hAnsi="Garamond"/>
-          <w:color w:val="919191"/>
-          <w:sz w:val="16"/>
-        </w:rPr>
-        <w:t>────────────────────────────</w:t>
-      </w:r>
-    </w:p>
-    <w:p>
-      <w:pPr>
         <w:spacing w:before="120" w:after="200" w:line="312" w:lineRule="auto"/>
         <w:ind w:left="454" w:right="454"/>
         <w:jc w:val="both"/>
@@ -3127,20 +2875,6 @@
     </w:p>
     <w:p>
       <w:pPr>
-        <w:spacing w:before="0" w:after="320"/>
-        <w:jc w:val="center"/>
-      </w:pPr>
-      <w:r>
-        <w:rPr>
-          <w:rFonts w:ascii="Garamond" w:hAnsi="Garamond"/>
-          <w:color w:val="919191"/>
-          <w:sz w:val="16"/>
-        </w:rPr>
-        <w:t>────────────────────────────</w:t>
-      </w:r>
-    </w:p>
-    <w:p>
-      <w:pPr>
         <w:spacing w:before="200" w:after="80" w:line="432" w:lineRule="auto"/>
         <w:jc w:val="right"/>
       </w:pPr>
@@ -3233,20 +2967,6 @@
     </w:p>
     <w:p>
       <w:pPr>
-        <w:spacing w:before="80" w:after="280"/>
-        <w:jc w:val="center"/>
-      </w:pPr>
-      <w:r>
-        <w:rPr>
-          <w:rFonts w:ascii="Garamond" w:hAnsi="Garamond"/>
-          <w:color w:val="919191"/>
-          <w:sz w:val="16"/>
-        </w:rPr>
-        <w:t>────────────────────────────</w:t>
-      </w:r>
-    </w:p>
-    <w:p>
-      <w:pPr>
         <w:spacing w:before="0" w:after="120" w:line="324" w:lineRule="auto"/>
         <w:ind w:firstLine="283"/>
         <w:jc w:val="both"/>
@@ -3473,20 +3193,6 @@
     </w:p>
     <w:p>
       <w:pPr>
-        <w:spacing w:before="160" w:after="120"/>
-        <w:jc w:val="center"/>
-      </w:pPr>
-      <w:r>
-        <w:rPr>
-          <w:rFonts w:ascii="Garamond" w:hAnsi="Garamond"/>
-          <w:color w:val="919191"/>
-          <w:sz w:val="16"/>
-        </w:rPr>
-        <w:t>────────────────────────────</w:t>
-      </w:r>
-    </w:p>
-    <w:p>
-      <w:pPr>
         <w:spacing w:before="120" w:after="200" w:line="312" w:lineRule="auto"/>
         <w:ind w:left="454" w:right="454"/>
         <w:jc w:val="both"/>
@@ -3556,20 +3262,6 @@
     </w:p>
     <w:p>
       <w:pPr>
-        <w:spacing w:before="0" w:after="320"/>
-        <w:jc w:val="center"/>
-      </w:pPr>
-      <w:r>
-        <w:rPr>
-          <w:rFonts w:ascii="Garamond" w:hAnsi="Garamond"/>
-          <w:color w:val="919191"/>
-          <w:sz w:val="16"/>
-        </w:rPr>
-        <w:t>────────────────────────────</w:t>
-      </w:r>
-    </w:p>
-    <w:p>
-      <w:pPr>
         <w:spacing w:before="200" w:after="80" w:line="432" w:lineRule="auto"/>
         <w:jc w:val="right"/>
       </w:pPr>
@@ -3662,20 +3354,6 @@
     </w:p>
     <w:p>
       <w:pPr>
-        <w:spacing w:before="80" w:after="280"/>
-        <w:jc w:val="center"/>
-      </w:pPr>
-      <w:r>
-        <w:rPr>
-          <w:rFonts w:ascii="Garamond" w:hAnsi="Garamond"/>
-          <w:color w:val="919191"/>
-          <w:sz w:val="16"/>
-        </w:rPr>
-        <w:t>────────────────────────────</w:t>
-      </w:r>
-    </w:p>
-    <w:p>
-      <w:pPr>
         <w:spacing w:before="0" w:after="120" w:line="324" w:lineRule="auto"/>
         <w:ind w:firstLine="283"/>
         <w:jc w:val="both"/>
@@ -3885,20 +3563,6 @@
     </w:p>
     <w:p>
       <w:pPr>
-        <w:spacing w:before="160" w:after="120"/>
-        <w:jc w:val="center"/>
-      </w:pPr>
-      <w:r>
-        <w:rPr>
-          <w:rFonts w:ascii="Garamond" w:hAnsi="Garamond"/>
-          <w:color w:val="919191"/>
-          <w:sz w:val="16"/>
-        </w:rPr>
-        <w:t>────────────────────────────</w:t>
-      </w:r>
-    </w:p>
-    <w:p>
-      <w:pPr>
         <w:spacing w:before="120" w:after="200" w:line="312" w:lineRule="auto"/>
         <w:ind w:left="454" w:right="454"/>
         <w:jc w:val="both"/>
@@ -3968,20 +3632,6 @@
     </w:p>
     <w:p>
       <w:pPr>
-        <w:spacing w:before="0" w:after="320"/>
-        <w:jc w:val="center"/>
-      </w:pPr>
-      <w:r>
-        <w:rPr>
-          <w:rFonts w:ascii="Garamond" w:hAnsi="Garamond"/>
-          <w:color w:val="919191"/>
-          <w:sz w:val="16"/>
-        </w:rPr>
-        <w:t>────────────────────────────</w:t>
-      </w:r>
-    </w:p>
-    <w:p>
-      <w:pPr>
         <w:spacing w:before="200" w:after="80" w:line="432" w:lineRule="auto"/>
         <w:jc w:val="right"/>
       </w:pPr>
@@ -4074,20 +3724,6 @@
     </w:p>
     <w:p>
       <w:pPr>
-        <w:spacing w:before="80" w:after="280"/>
-        <w:jc w:val="center"/>
-      </w:pPr>
-      <w:r>
-        <w:rPr>
-          <w:rFonts w:ascii="Garamond" w:hAnsi="Garamond"/>
-          <w:color w:val="919191"/>
-          <w:sz w:val="16"/>
-        </w:rPr>
-        <w:t>────────────────────────────</w:t>
-      </w:r>
-    </w:p>
-    <w:p>
-      <w:pPr>
         <w:spacing w:before="0" w:after="120" w:line="324" w:lineRule="auto"/>
         <w:ind w:firstLine="283"/>
         <w:jc w:val="both"/>
@@ -4314,20 +3950,6 @@
     </w:p>
     <w:p>
       <w:pPr>
-        <w:spacing w:before="160" w:after="120"/>
-        <w:jc w:val="center"/>
-      </w:pPr>
-      <w:r>
-        <w:rPr>
-          <w:rFonts w:ascii="Garamond" w:hAnsi="Garamond"/>
-          <w:color w:val="919191"/>
-          <w:sz w:val="16"/>
-        </w:rPr>
-        <w:t>────────────────────────────</w:t>
-      </w:r>
-    </w:p>
-    <w:p>
-      <w:pPr>
         <w:spacing w:before="120" w:after="200" w:line="312" w:lineRule="auto"/>
         <w:ind w:left="454" w:right="454"/>
         <w:jc w:val="both"/>
@@ -4402,20 +4024,6 @@
     </w:p>
     <w:p>
       <w:pPr>
-        <w:spacing w:before="0" w:after="200"/>
-        <w:jc w:val="center"/>
-      </w:pPr>
-      <w:r>
-        <w:rPr>
-          <w:rFonts w:ascii="Garamond" w:hAnsi="Garamond"/>
-          <w:color w:val="919191"/>
-          <w:sz w:val="16"/>
-        </w:rPr>
-        <w:t>────────────────────────────</w:t>
-      </w:r>
-    </w:p>
-    <w:p>
-      <w:pPr>
         <w:spacing w:before="0" w:after="120" w:line="324" w:lineRule="auto"/>
         <w:jc w:val="center"/>
       </w:pPr>
@@ -4485,20 +4093,6 @@
     </w:p>
     <w:p>
       <w:pPr>
-        <w:spacing w:before="0" w:after="320"/>
-        <w:jc w:val="center"/>
-      </w:pPr>
-      <w:r>
-        <w:rPr>
-          <w:rFonts w:ascii="Garamond" w:hAnsi="Garamond"/>
-          <w:color w:val="919191"/>
-          <w:sz w:val="16"/>
-        </w:rPr>
-        <w:t>────────────────────────────</w:t>
-      </w:r>
-    </w:p>
-    <w:p>
-      <w:pPr>
         <w:spacing w:before="200" w:after="80" w:line="432" w:lineRule="auto"/>
         <w:jc w:val="right"/>
       </w:pPr>
@@ -4591,20 +4185,6 @@
     </w:p>
     <w:p>
       <w:pPr>
-        <w:spacing w:before="80" w:after="280"/>
-        <w:jc w:val="center"/>
-      </w:pPr>
-      <w:r>
-        <w:rPr>
-          <w:rFonts w:ascii="Garamond" w:hAnsi="Garamond"/>
-          <w:color w:val="919191"/>
-          <w:sz w:val="16"/>
-        </w:rPr>
-        <w:t>────────────────────────────</w:t>
-      </w:r>
-    </w:p>
-    <w:p>
-      <w:pPr>
         <w:spacing w:before="0" w:after="120" w:line="324" w:lineRule="auto"/>
         <w:ind w:firstLine="283"/>
         <w:jc w:val="both"/>
@@ -4831,20 +4411,6 @@
     </w:p>
     <w:p>
       <w:pPr>
-        <w:spacing w:before="160" w:after="120"/>
-        <w:jc w:val="center"/>
-      </w:pPr>
-      <w:r>
-        <w:rPr>
-          <w:rFonts w:ascii="Garamond" w:hAnsi="Garamond"/>
-          <w:color w:val="919191"/>
-          <w:sz w:val="16"/>
-        </w:rPr>
-        <w:t>────────────────────────────</w:t>
-      </w:r>
-    </w:p>
-    <w:p>
-      <w:pPr>
         <w:spacing w:before="120" w:after="200" w:line="312" w:lineRule="auto"/>
         <w:ind w:left="454" w:right="454"/>
         <w:jc w:val="both"/>
@@ -4914,20 +4480,6 @@
     </w:p>
     <w:p>
       <w:pPr>
-        <w:spacing w:before="0" w:after="320"/>
-        <w:jc w:val="center"/>
-      </w:pPr>
-      <w:r>
-        <w:rPr>
-          <w:rFonts w:ascii="Garamond" w:hAnsi="Garamond"/>
-          <w:color w:val="919191"/>
-          <w:sz w:val="16"/>
-        </w:rPr>
-        <w:t>────────────────────────────</w:t>
-      </w:r>
-    </w:p>
-    <w:p>
-      <w:pPr>
         <w:spacing w:before="200" w:after="80" w:line="432" w:lineRule="auto"/>
         <w:jc w:val="right"/>
       </w:pPr>
@@ -5020,20 +4572,6 @@
     </w:p>
     <w:p>
       <w:pPr>
-        <w:spacing w:before="80" w:after="280"/>
-        <w:jc w:val="center"/>
-      </w:pPr>
-      <w:r>
-        <w:rPr>
-          <w:rFonts w:ascii="Garamond" w:hAnsi="Garamond"/>
-          <w:color w:val="919191"/>
-          <w:sz w:val="16"/>
-        </w:rPr>
-        <w:t>────────────────────────────</w:t>
-      </w:r>
-    </w:p>
-    <w:p>
-      <w:pPr>
         <w:spacing w:before="0" w:after="120" w:line="324" w:lineRule="auto"/>
         <w:ind w:firstLine="283"/>
         <w:jc w:val="both"/>
@@ -5277,20 +4815,6 @@
     </w:p>
     <w:p>
       <w:pPr>
-        <w:spacing w:before="160" w:after="120"/>
-        <w:jc w:val="center"/>
-      </w:pPr>
-      <w:r>
-        <w:rPr>
-          <w:rFonts w:ascii="Garamond" w:hAnsi="Garamond"/>
-          <w:color w:val="919191"/>
-          <w:sz w:val="16"/>
-        </w:rPr>
-        <w:t>────────────────────────────</w:t>
-      </w:r>
-    </w:p>
-    <w:p>
-      <w:pPr>
         <w:spacing w:before="120" w:after="200" w:line="312" w:lineRule="auto"/>
         <w:ind w:left="454" w:right="454"/>
         <w:jc w:val="both"/>
@@ -5360,20 +4884,6 @@
     </w:p>
     <w:p>
       <w:pPr>
-        <w:spacing w:before="0" w:after="320"/>
-        <w:jc w:val="center"/>
-      </w:pPr>
-      <w:r>
-        <w:rPr>
-          <w:rFonts w:ascii="Garamond" w:hAnsi="Garamond"/>
-          <w:color w:val="919191"/>
-          <w:sz w:val="16"/>
-        </w:rPr>
-        <w:t>────────────────────────────</w:t>
-      </w:r>
-    </w:p>
-    <w:p>
-      <w:pPr>
         <w:spacing w:before="200" w:after="80" w:line="432" w:lineRule="auto"/>
         <w:jc w:val="right"/>
       </w:pPr>
@@ -5466,20 +4976,6 @@
     </w:p>
     <w:p>
       <w:pPr>
-        <w:spacing w:before="80" w:after="280"/>
-        <w:jc w:val="center"/>
-      </w:pPr>
-      <w:r>
-        <w:rPr>
-          <w:rFonts w:ascii="Garamond" w:hAnsi="Garamond"/>
-          <w:color w:val="919191"/>
-          <w:sz w:val="16"/>
-        </w:rPr>
-        <w:t>────────────────────────────</w:t>
-      </w:r>
-    </w:p>
-    <w:p>
-      <w:pPr>
         <w:spacing w:before="0" w:after="120" w:line="324" w:lineRule="auto"/>
         <w:ind w:firstLine="283"/>
         <w:jc w:val="both"/>
@@ -5723,20 +5219,6 @@
     </w:p>
     <w:p>
       <w:pPr>
-        <w:spacing w:before="160" w:after="120"/>
-        <w:jc w:val="center"/>
-      </w:pPr>
-      <w:r>
-        <w:rPr>
-          <w:rFonts w:ascii="Garamond" w:hAnsi="Garamond"/>
-          <w:color w:val="919191"/>
-          <w:sz w:val="16"/>
-        </w:rPr>
-        <w:t>────────────────────────────</w:t>
-      </w:r>
-    </w:p>
-    <w:p>
-      <w:pPr>
         <w:spacing w:before="120" w:after="200" w:line="312" w:lineRule="auto"/>
         <w:ind w:left="454" w:right="454"/>
         <w:jc w:val="both"/>
@@ -5806,20 +5288,6 @@
     </w:p>
     <w:p>
       <w:pPr>
-        <w:spacing w:before="0" w:after="320"/>
-        <w:jc w:val="center"/>
-      </w:pPr>
-      <w:r>
-        <w:rPr>
-          <w:rFonts w:ascii="Garamond" w:hAnsi="Garamond"/>
-          <w:color w:val="919191"/>
-          <w:sz w:val="16"/>
-        </w:rPr>
-        <w:t>────────────────────────────</w:t>
-      </w:r>
-    </w:p>
-    <w:p>
-      <w:pPr>
         <w:spacing w:before="200" w:after="80" w:line="432" w:lineRule="auto"/>
         <w:jc w:val="right"/>
       </w:pPr>
@@ -5908,20 +5376,6 @@
           <w:sz w:val="18"/>
         </w:rPr>
         <w:t>(HR. Muslim no. 918 (Doa Ummu Salamah))</w:t>
-      </w:r>
-    </w:p>
-    <w:p>
-      <w:pPr>
-        <w:spacing w:before="80" w:after="280"/>
-        <w:jc w:val="center"/>
-      </w:pPr>
-      <w:r>
-        <w:rPr>
-          <w:rFonts w:ascii="Garamond" w:hAnsi="Garamond"/>
-          <w:color w:val="919191"/>
-          <w:sz w:val="16"/>
-        </w:rPr>
-        <w:t>────────────────────────────</w:t>
       </w:r>
     </w:p>
     <w:p>
@@ -6156,20 +5610,6 @@
           <w:sz w:val="22"/>
         </w:rPr>
         <w:t>Janji Al-Qur'an terbukti presisi secara ilmiah dan psikologis: 'Inna ma'al 'usri yusra', sesungguhnya bersama kesulitan itu ada kemudahan yang menyertainya. Kata kemudahan (*al-yusr*) disebutkan dalam bentuk definitif (ma'rifah), sedangkan kesulitan (*al-'usr*) dalam bentuk indefinitif (nakirah), menandakan bahwa satu kesulitan tidak akan pernah mampu mengalahkan dua kemudahan yang berlipat ganda.</w:t>
-      </w:r>
-    </w:p>
-    <w:p>
-      <w:pPr>
-        <w:spacing w:before="160" w:after="120"/>
-        <w:jc w:val="center"/>
-      </w:pPr>
-      <w:r>
-        <w:rPr>
-          <w:rFonts w:ascii="Garamond" w:hAnsi="Garamond"/>
-          <w:color w:val="919191"/>
-          <w:sz w:val="16"/>
-        </w:rPr>
-        <w:t>────────────────────────────</w:t>
       </w:r>
     </w:p>
     <w:p>

</xml_diff>